<commit_message>
Day before Last Day on Task 3a
</commit_message>
<xml_diff>
--- a/Task3a/Gathering Feedback Template.docx
+++ b/Task3a/Gathering Feedback Template.docx
@@ -1,6 +1,6 @@
 
 <file path=word/document.xml><?xml version="1.0" encoding="utf-8"?>
-<w:document xmlns:wpc="http://schemas.microsoft.com/office/word/2010/wordprocessingCanvas" xmlns:cx="http://schemas.microsoft.com/office/drawing/2014/chartex" xmlns:cx1="http://schemas.microsoft.com/office/drawing/2015/9/8/chartex" xmlns:cx2="http://schemas.microsoft.com/office/drawing/2015/10/21/chartex" xmlns:cx3="http://schemas.microsoft.com/office/drawing/2016/5/9/chartex" xmlns:cx4="http://schemas.microsoft.com/office/drawing/2016/5/10/chartex" xmlns:cx5="http://schemas.microsoft.com/office/drawing/2016/5/11/chartex" xmlns:cx6="http://schemas.microsoft.com/office/drawing/2016/5/12/chartex" xmlns:cx7="http://schemas.microsoft.com/office/drawing/2016/5/13/chartex" xmlns:cx8="http://schemas.microsoft.com/office/drawing/2016/5/14/chartex" xmlns:mc="http://schemas.openxmlformats.org/markup-compatibility/2006" xmlns:aink="http://schemas.microsoft.com/office/drawing/2016/ink" xmlns:am3d="http://schemas.microsoft.com/office/drawing/2017/model3d" xmlns:o="urn:schemas-microsoft-com:office:office" xmlns:r="http://schemas.openxmlformats.org/officeDocument/2006/relationships" xmlns:m="http://schemas.openxmlformats.org/officeDocument/2006/math" xmlns:v="urn:schemas-microsoft-com:vml" xmlns:wp14="http://schemas.microsoft.com/office/word/2010/wordprocessingDrawing" xmlns:wp="http://schemas.openxmlformats.org/drawingml/2006/wordprocessingDrawing" xmlns:w10="urn:schemas-microsoft-com:office:word" xmlns:w="http://schemas.openxmlformats.org/wordprocessingml/2006/main" xmlns:w14="http://schemas.microsoft.com/office/word/2010/wordml" xmlns:w15="http://schemas.microsoft.com/office/word/2012/wordml" xmlns:w16cex="http://schemas.microsoft.com/office/word/2018/wordml/cex" xmlns:w16cid="http://schemas.microsoft.com/office/word/2016/wordml/cid" xmlns:w16="http://schemas.microsoft.com/office/word/2018/wordml" xmlns:w16sdtdh="http://schemas.microsoft.com/office/word/2020/wordml/sdtdatahash" xmlns:w16se="http://schemas.microsoft.com/office/word/2015/wordml/symex" xmlns:wpg="http://schemas.microsoft.com/office/word/2010/wordprocessingGroup" xmlns:wpi="http://schemas.microsoft.com/office/word/2010/wordprocessingInk" xmlns:wne="http://schemas.microsoft.com/office/word/2006/wordml" xmlns:wps="http://schemas.microsoft.com/office/word/2010/wordprocessingShape" mc:Ignorable="w14 w15 w16se w16cid w16 w16cex w16sdtdh wp14">
+<w:document xmlns:wpc="http://schemas.microsoft.com/office/word/2010/wordprocessingCanvas" xmlns:cx="http://schemas.microsoft.com/office/drawing/2014/chartex" xmlns:cx1="http://schemas.microsoft.com/office/drawing/2015/9/8/chartex" xmlns:cx2="http://schemas.microsoft.com/office/drawing/2015/10/21/chartex" xmlns:cx3="http://schemas.microsoft.com/office/drawing/2016/5/9/chartex" xmlns:cx4="http://schemas.microsoft.com/office/drawing/2016/5/10/chartex" xmlns:cx5="http://schemas.microsoft.com/office/drawing/2016/5/11/chartex" xmlns:cx6="http://schemas.microsoft.com/office/drawing/2016/5/12/chartex" xmlns:cx7="http://schemas.microsoft.com/office/drawing/2016/5/13/chartex" xmlns:cx8="http://schemas.microsoft.com/office/drawing/2016/5/14/chartex" xmlns:mc="http://schemas.openxmlformats.org/markup-compatibility/2006" xmlns:aink="http://schemas.microsoft.com/office/drawing/2016/ink" xmlns:am3d="http://schemas.microsoft.com/office/drawing/2017/model3d" xmlns:o="urn:schemas-microsoft-com:office:office" xmlns:oel="http://schemas.microsoft.com/office/2019/extlst" xmlns:r="http://schemas.openxmlformats.org/officeDocument/2006/relationships" xmlns:m="http://schemas.openxmlformats.org/officeDocument/2006/math" xmlns:v="urn:schemas-microsoft-com:vml" xmlns:wp14="http://schemas.microsoft.com/office/word/2010/wordprocessingDrawing" xmlns:wp="http://schemas.openxmlformats.org/drawingml/2006/wordprocessingDrawing" xmlns:w10="urn:schemas-microsoft-com:office:word" xmlns:w="http://schemas.openxmlformats.org/wordprocessingml/2006/main" xmlns:w14="http://schemas.microsoft.com/office/word/2010/wordml" xmlns:w15="http://schemas.microsoft.com/office/word/2012/wordml" xmlns:w16cex="http://schemas.microsoft.com/office/word/2018/wordml/cex" xmlns:w16cid="http://schemas.microsoft.com/office/word/2016/wordml/cid" xmlns:w16="http://schemas.microsoft.com/office/word/2018/wordml" xmlns:w16du="http://schemas.microsoft.com/office/word/2023/wordml/word16du" xmlns:w16sdtdh="http://schemas.microsoft.com/office/word/2020/wordml/sdtdatahash" xmlns:w16sdtfl="http://schemas.microsoft.com/office/word/2024/wordml/sdtformatlock" xmlns:w16se="http://schemas.microsoft.com/office/word/2015/wordml/symex" xmlns:wpg="http://schemas.microsoft.com/office/word/2010/wordprocessingGroup" xmlns:wpi="http://schemas.microsoft.com/office/word/2010/wordprocessingInk" xmlns:wne="http://schemas.microsoft.com/office/word/2006/wordml" xmlns:wps="http://schemas.microsoft.com/office/word/2010/wordprocessingShape" mc:Ignorable="w14 w15 w16se w16cid w16 w16cex w16sdtdh w16sdtfl w16du wp14">
   <w:body>
     <w:p>
       <w:pPr>
@@ -184,7 +184,10 @@
         </w:numPr>
       </w:pPr>
       <w:r>
-        <w:t xml:space="preserve">Paired Coding Reviews – Technical Audience </w:t>
+        <w:t>c</w:t>
+      </w:r>
+      <w:r>
+        <w:t xml:space="preserve"> – Technical Audience </w:t>
       </w:r>
     </w:p>
     <w:p>
@@ -470,6 +473,7 @@
           <w:ilvl w:val="0"/>
           <w:numId w:val="1"/>
         </w:numPr>
+        <w:spacing w:before="240"/>
       </w:pPr>
       <w:r>
         <w:rPr>
@@ -542,14 +546,1903 @@
         <w:t xml:space="preserve">on what majority of users think and look for on the solution. I will tailor the feedback form to the non-technical users by using non-technical terminology that any person could understand and answer. </w:t>
       </w:r>
     </w:p>
+    <w:p>
+      <w:pPr>
+        <w:spacing w:before="240"/>
+        <w:rPr>
+          <w:b/>
+          <w:bCs/>
+          <w:sz w:val="24"/>
+          <w:szCs w:val="24"/>
+        </w:rPr>
+      </w:pPr>
+    </w:p>
+    <w:p>
+      <w:pPr>
+        <w:spacing w:before="240"/>
+        <w:rPr>
+          <w:b/>
+          <w:bCs/>
+          <w:sz w:val="24"/>
+          <w:szCs w:val="24"/>
+        </w:rPr>
+      </w:pPr>
+      <w:r>
+        <w:rPr>
+          <w:b/>
+          <w:bCs/>
+          <w:sz w:val="24"/>
+          <w:szCs w:val="24"/>
+        </w:rPr>
+        <w:t>How the method will be delivered and recorded</w:t>
+      </w:r>
+      <w:r>
+        <w:rPr>
+          <w:b/>
+          <w:bCs/>
+          <w:sz w:val="24"/>
+          <w:szCs w:val="24"/>
+        </w:rPr>
+        <w:t>:</w:t>
+      </w:r>
+    </w:p>
+    <w:p>
+      <w:pPr>
+        <w:pStyle w:val="ListParagraph"/>
+        <w:numPr>
+          <w:ilvl w:val="0"/>
+          <w:numId w:val="11"/>
+        </w:numPr>
+        <w:spacing w:before="240"/>
+        <w:rPr>
+          <w:b/>
+          <w:bCs/>
+          <w:sz w:val="24"/>
+          <w:szCs w:val="24"/>
+        </w:rPr>
+      </w:pPr>
+      <w:r>
+        <w:rPr>
+          <w:b/>
+          <w:bCs/>
+          <w:sz w:val="24"/>
+          <w:szCs w:val="24"/>
+        </w:rPr>
+        <w:t xml:space="preserve"> </w:t>
+      </w:r>
+      <w:r>
+        <w:rPr>
+          <w:sz w:val="24"/>
+          <w:szCs w:val="24"/>
+        </w:rPr>
+        <w:t>Questionnaire will be created using Microsoft Forms</w:t>
+      </w:r>
+    </w:p>
+    <w:p>
+      <w:pPr>
+        <w:pStyle w:val="ListParagraph"/>
+        <w:numPr>
+          <w:ilvl w:val="0"/>
+          <w:numId w:val="11"/>
+        </w:numPr>
+        <w:spacing w:before="240"/>
+        <w:rPr>
+          <w:b/>
+          <w:bCs/>
+          <w:sz w:val="24"/>
+          <w:szCs w:val="24"/>
+        </w:rPr>
+      </w:pPr>
+      <w:r>
+        <w:rPr>
+          <w:sz w:val="24"/>
+          <w:szCs w:val="24"/>
+        </w:rPr>
+        <w:t>The forms link will be sent to selected non-technical users via email</w:t>
+      </w:r>
+    </w:p>
+    <w:p>
+      <w:pPr>
+        <w:pStyle w:val="ListParagraph"/>
+        <w:numPr>
+          <w:ilvl w:val="0"/>
+          <w:numId w:val="11"/>
+        </w:numPr>
+        <w:spacing w:before="240"/>
+        <w:rPr>
+          <w:b/>
+          <w:bCs/>
+          <w:sz w:val="24"/>
+          <w:szCs w:val="24"/>
+        </w:rPr>
+      </w:pPr>
+      <w:r>
+        <w:rPr>
+          <w:sz w:val="24"/>
+          <w:szCs w:val="24"/>
+        </w:rPr>
+        <w:t>In the email it will explain to the user that they should use the system for 10 minutes and then complete the form via the link in the email</w:t>
+      </w:r>
+    </w:p>
+    <w:p>
+      <w:pPr>
+        <w:pStyle w:val="ListParagraph"/>
+        <w:numPr>
+          <w:ilvl w:val="0"/>
+          <w:numId w:val="11"/>
+        </w:numPr>
+        <w:spacing w:before="240"/>
+        <w:rPr>
+          <w:b/>
+          <w:bCs/>
+          <w:sz w:val="24"/>
+          <w:szCs w:val="24"/>
+        </w:rPr>
+      </w:pPr>
+      <w:r>
+        <w:rPr>
+          <w:sz w:val="24"/>
+          <w:szCs w:val="24"/>
+        </w:rPr>
+        <w:t>All responses will be collected automatically and anonymously</w:t>
+      </w:r>
+    </w:p>
+    <w:p>
+      <w:pPr>
+        <w:pStyle w:val="ListParagraph"/>
+        <w:numPr>
+          <w:ilvl w:val="0"/>
+          <w:numId w:val="11"/>
+        </w:numPr>
+        <w:spacing w:before="240"/>
+        <w:rPr>
+          <w:b/>
+          <w:bCs/>
+          <w:sz w:val="24"/>
+          <w:szCs w:val="24"/>
+        </w:rPr>
+      </w:pPr>
+      <w:r>
+        <w:rPr>
+          <w:sz w:val="24"/>
+          <w:szCs w:val="24"/>
+        </w:rPr>
+        <w:t>Finally,</w:t>
+      </w:r>
+      <w:r>
+        <w:rPr>
+          <w:sz w:val="24"/>
+          <w:szCs w:val="24"/>
+        </w:rPr>
+        <w:t xml:space="preserve"> all responses will be analysed and </w:t>
+      </w:r>
+      <w:r>
+        <w:rPr>
+          <w:sz w:val="24"/>
+          <w:szCs w:val="24"/>
+        </w:rPr>
+        <w:t>displayed in graphs, charts and open comments.</w:t>
+      </w:r>
+    </w:p>
+    <w:p>
+      <w:pPr>
+        <w:spacing w:before="240"/>
+        <w:rPr>
+          <w:b/>
+          <w:bCs/>
+          <w:sz w:val="24"/>
+          <w:szCs w:val="24"/>
+        </w:rPr>
+      </w:pPr>
+    </w:p>
+    <w:p>
+      <w:pPr>
+        <w:pStyle w:val="Heading1"/>
+      </w:pPr>
+      <w:r>
+        <w:t>Observations</w:t>
+      </w:r>
+      <w:r>
+        <w:t>, Non-Technical Audience</w:t>
+      </w:r>
+    </w:p>
+    <w:p>
+      <w:pPr>
+        <w:spacing w:before="240"/>
+        <w:rPr>
+          <w:b/>
+          <w:bCs/>
+          <w:sz w:val="24"/>
+          <w:szCs w:val="24"/>
+        </w:rPr>
+      </w:pPr>
+      <w:r>
+        <w:rPr>
+          <w:b/>
+          <w:bCs/>
+          <w:sz w:val="24"/>
+          <w:szCs w:val="24"/>
+        </w:rPr>
+        <w:t>Method of Use:</w:t>
+      </w:r>
+    </w:p>
+    <w:p>
+      <w:pPr>
+        <w:pStyle w:val="ListParagraph"/>
+        <w:numPr>
+          <w:ilvl w:val="0"/>
+          <w:numId w:val="1"/>
+        </w:numPr>
+        <w:spacing w:before="240"/>
+      </w:pPr>
+      <w:r>
+        <w:rPr>
+          <w:sz w:val="24"/>
+          <w:szCs w:val="24"/>
+        </w:rPr>
+        <w:t>Feedback will be gathered from non-technical users using an online form. They will have to execute 5 specific scenarios using the digital solution and then fill out the form.</w:t>
+      </w:r>
+    </w:p>
     <w:p/>
     <w:p>
-      <w:r>
-        <w:t>Technical Audience</w:t>
+      <w:pPr>
+        <w:spacing w:before="240"/>
+        <w:rPr>
+          <w:b/>
+          <w:bCs/>
+          <w:sz w:val="24"/>
+          <w:szCs w:val="24"/>
+        </w:rPr>
+      </w:pPr>
+      <w:r>
+        <w:rPr>
+          <w:b/>
+          <w:bCs/>
+          <w:sz w:val="24"/>
+          <w:szCs w:val="24"/>
+        </w:rPr>
+        <w:lastRenderedPageBreak/>
+        <w:t>How the method will be delivered and recorded</w:t>
+      </w:r>
+      <w:r>
+        <w:rPr>
+          <w:b/>
+          <w:bCs/>
+          <w:sz w:val="24"/>
+          <w:szCs w:val="24"/>
+        </w:rPr>
+        <w:t>:</w:t>
+      </w:r>
+    </w:p>
+    <w:p>
+      <w:pPr>
+        <w:pStyle w:val="ListParagraph"/>
+        <w:numPr>
+          <w:ilvl w:val="0"/>
+          <w:numId w:val="12"/>
+        </w:numPr>
+        <w:spacing w:before="240"/>
+        <w:rPr>
+          <w:b/>
+          <w:bCs/>
+          <w:sz w:val="24"/>
+          <w:szCs w:val="24"/>
+        </w:rPr>
+      </w:pPr>
+      <w:r>
+        <w:rPr>
+          <w:b/>
+          <w:bCs/>
+          <w:sz w:val="24"/>
+          <w:szCs w:val="24"/>
+        </w:rPr>
+        <w:t xml:space="preserve"> </w:t>
+      </w:r>
+      <w:r>
+        <w:rPr>
+          <w:sz w:val="24"/>
+          <w:szCs w:val="24"/>
+        </w:rPr>
+        <w:t>Observed scenario testing</w:t>
+      </w:r>
+      <w:r>
+        <w:rPr>
+          <w:sz w:val="24"/>
+          <w:szCs w:val="24"/>
+        </w:rPr>
+        <w:t xml:space="preserve"> will be </w:t>
+      </w:r>
+      <w:r>
+        <w:rPr>
+          <w:sz w:val="24"/>
+          <w:szCs w:val="24"/>
+        </w:rPr>
+        <w:t>performed</w:t>
+      </w:r>
+      <w:r>
+        <w:rPr>
+          <w:sz w:val="24"/>
+          <w:szCs w:val="24"/>
+        </w:rPr>
+        <w:t xml:space="preserve"> using Microsoft Forms</w:t>
+      </w:r>
+    </w:p>
+    <w:p>
+      <w:pPr>
+        <w:pStyle w:val="ListParagraph"/>
+        <w:numPr>
+          <w:ilvl w:val="0"/>
+          <w:numId w:val="12"/>
+        </w:numPr>
+        <w:spacing w:before="240"/>
+        <w:rPr>
+          <w:b/>
+          <w:bCs/>
+          <w:sz w:val="24"/>
+          <w:szCs w:val="24"/>
+        </w:rPr>
+      </w:pPr>
+      <w:r>
+        <w:rPr>
+          <w:sz w:val="24"/>
+          <w:szCs w:val="24"/>
+        </w:rPr>
+        <w:t>The forms link will be sent to selected non-technical users via email</w:t>
+      </w:r>
+    </w:p>
+    <w:p>
+      <w:pPr>
+        <w:pStyle w:val="ListParagraph"/>
+        <w:numPr>
+          <w:ilvl w:val="0"/>
+          <w:numId w:val="12"/>
+        </w:numPr>
+        <w:spacing w:before="240"/>
+        <w:rPr>
+          <w:b/>
+          <w:bCs/>
+          <w:sz w:val="24"/>
+          <w:szCs w:val="24"/>
+        </w:rPr>
+      </w:pPr>
+      <w:r>
+        <w:rPr>
+          <w:sz w:val="24"/>
+          <w:szCs w:val="24"/>
+        </w:rPr>
+        <w:t>In the email</w:t>
+      </w:r>
+      <w:r>
+        <w:rPr>
+          <w:sz w:val="24"/>
+          <w:szCs w:val="24"/>
+        </w:rPr>
+        <w:t xml:space="preserve"> and form</w:t>
+      </w:r>
+      <w:r>
+        <w:rPr>
+          <w:sz w:val="24"/>
+          <w:szCs w:val="24"/>
+        </w:rPr>
+        <w:t xml:space="preserve"> it will explain to the user </w:t>
+      </w:r>
+      <w:r>
+        <w:rPr>
+          <w:sz w:val="24"/>
+          <w:szCs w:val="24"/>
+        </w:rPr>
+        <w:t>the 5 scenarios they must try to complete, after they will fill out</w:t>
+      </w:r>
+      <w:r>
+        <w:rPr>
+          <w:sz w:val="24"/>
+          <w:szCs w:val="24"/>
+        </w:rPr>
+        <w:t xml:space="preserve"> the form via the link in the email</w:t>
+      </w:r>
+    </w:p>
+    <w:p>
+      <w:pPr>
+        <w:pStyle w:val="ListParagraph"/>
+        <w:numPr>
+          <w:ilvl w:val="0"/>
+          <w:numId w:val="12"/>
+        </w:numPr>
+        <w:spacing w:before="240"/>
+        <w:rPr>
+          <w:b/>
+          <w:bCs/>
+          <w:sz w:val="24"/>
+          <w:szCs w:val="24"/>
+        </w:rPr>
+      </w:pPr>
+      <w:r>
+        <w:rPr>
+          <w:sz w:val="24"/>
+          <w:szCs w:val="24"/>
+        </w:rPr>
+        <w:t>All responses will be collected automatically and anonymously</w:t>
+      </w:r>
+    </w:p>
+    <w:p>
+      <w:pPr>
+        <w:pStyle w:val="ListParagraph"/>
+        <w:numPr>
+          <w:ilvl w:val="0"/>
+          <w:numId w:val="12"/>
+        </w:numPr>
+        <w:spacing w:before="240"/>
+        <w:rPr>
+          <w:b/>
+          <w:bCs/>
+          <w:sz w:val="24"/>
+          <w:szCs w:val="24"/>
+        </w:rPr>
+      </w:pPr>
+      <w:r>
+        <w:rPr>
+          <w:sz w:val="24"/>
+          <w:szCs w:val="24"/>
+        </w:rPr>
+        <w:t>Finally, all responses will be analysed and displayed in graphs, charts and open comments.</w:t>
       </w:r>
     </w:p>
     <w:p/>
     <w:p/>
+    <w:p>
+      <w:pPr>
+        <w:pStyle w:val="Heading1"/>
+      </w:pPr>
+      <w:r>
+        <w:t>Paired Coding Reviews,</w:t>
+      </w:r>
+      <w:r>
+        <w:t xml:space="preserve"> </w:t>
+      </w:r>
+      <w:r>
+        <w:t>Technical Audience</w:t>
+      </w:r>
+    </w:p>
+    <w:p>
+      <w:pPr>
+        <w:spacing w:before="240"/>
+        <w:rPr>
+          <w:b/>
+          <w:bCs/>
+          <w:sz w:val="24"/>
+          <w:szCs w:val="24"/>
+        </w:rPr>
+      </w:pPr>
+      <w:r>
+        <w:rPr>
+          <w:b/>
+          <w:bCs/>
+          <w:sz w:val="24"/>
+          <w:szCs w:val="24"/>
+        </w:rPr>
+        <w:t>Method of Use:</w:t>
+      </w:r>
+    </w:p>
+    <w:p>
+      <w:pPr>
+        <w:pStyle w:val="ListParagraph"/>
+        <w:numPr>
+          <w:ilvl w:val="0"/>
+          <w:numId w:val="1"/>
+        </w:numPr>
+        <w:spacing w:before="240"/>
+      </w:pPr>
+      <w:r>
+        <w:rPr>
+          <w:sz w:val="24"/>
+          <w:szCs w:val="24"/>
+        </w:rPr>
+        <w:t>Technical users will have two monitor screens</w:t>
+      </w:r>
+      <w:r>
+        <w:rPr>
+          <w:sz w:val="24"/>
+          <w:szCs w:val="24"/>
+        </w:rPr>
+        <w:t>,</w:t>
+      </w:r>
+      <w:r>
+        <w:rPr>
+          <w:sz w:val="24"/>
+          <w:szCs w:val="24"/>
+        </w:rPr>
+        <w:t xml:space="preserve"> displaying the programs cod</w:t>
+      </w:r>
+      <w:r>
+        <w:rPr>
+          <w:sz w:val="24"/>
+          <w:szCs w:val="24"/>
+        </w:rPr>
+        <w:t>e and the working web application on each screen. While they test and look through the digital solution, I will ask the technical user questions from an online form I created. I will fill out the form based on their experience and they will try find any areas of improvement. The online form will use technical language that only technically qualified individuals will be able to answer. This method will be used</w:t>
+      </w:r>
+      <w:r>
+        <w:rPr>
+          <w:sz w:val="24"/>
+          <w:szCs w:val="24"/>
+        </w:rPr>
+        <w:t xml:space="preserve"> so that I can tackle all parts of program together with a technical user like me, the online form will be covering all parts of the code and program as well.</w:t>
+      </w:r>
+    </w:p>
+    <w:p>
+      <w:pPr>
+        <w:spacing w:before="240"/>
+        <w:rPr>
+          <w:b/>
+          <w:bCs/>
+          <w:sz w:val="24"/>
+          <w:szCs w:val="24"/>
+        </w:rPr>
+      </w:pPr>
+    </w:p>
+    <w:p>
+      <w:pPr>
+        <w:spacing w:before="240"/>
+        <w:rPr>
+          <w:b/>
+          <w:bCs/>
+          <w:sz w:val="24"/>
+          <w:szCs w:val="24"/>
+        </w:rPr>
+      </w:pPr>
+      <w:r>
+        <w:rPr>
+          <w:b/>
+          <w:bCs/>
+          <w:sz w:val="24"/>
+          <w:szCs w:val="24"/>
+        </w:rPr>
+        <w:t>How the method will be delivered and recorded</w:t>
+      </w:r>
+      <w:r>
+        <w:rPr>
+          <w:b/>
+          <w:bCs/>
+          <w:sz w:val="24"/>
+          <w:szCs w:val="24"/>
+        </w:rPr>
+        <w:t>:</w:t>
+      </w:r>
+    </w:p>
+    <w:p>
+      <w:pPr>
+        <w:pStyle w:val="ListParagraph"/>
+        <w:numPr>
+          <w:ilvl w:val="0"/>
+          <w:numId w:val="14"/>
+        </w:numPr>
+        <w:spacing w:before="240"/>
+        <w:rPr>
+          <w:b/>
+          <w:bCs/>
+          <w:sz w:val="24"/>
+          <w:szCs w:val="24"/>
+        </w:rPr>
+      </w:pPr>
+      <w:r>
+        <w:rPr>
+          <w:sz w:val="24"/>
+          <w:szCs w:val="24"/>
+        </w:rPr>
+        <w:t>Online form will be created using Microsoft Forms</w:t>
+      </w:r>
+    </w:p>
+    <w:p>
+      <w:pPr>
+        <w:pStyle w:val="ListParagraph"/>
+        <w:numPr>
+          <w:ilvl w:val="0"/>
+          <w:numId w:val="14"/>
+        </w:numPr>
+        <w:spacing w:before="240"/>
+        <w:rPr>
+          <w:b/>
+          <w:bCs/>
+          <w:sz w:val="24"/>
+          <w:szCs w:val="24"/>
+        </w:rPr>
+      </w:pPr>
+      <w:r>
+        <w:rPr>
+          <w:sz w:val="24"/>
+          <w:szCs w:val="24"/>
+        </w:rPr>
+        <w:t>A technical peer will be selected</w:t>
+      </w:r>
+    </w:p>
+    <w:p>
+      <w:pPr>
+        <w:pStyle w:val="ListParagraph"/>
+        <w:numPr>
+          <w:ilvl w:val="0"/>
+          <w:numId w:val="14"/>
+        </w:numPr>
+        <w:spacing w:before="240"/>
+        <w:rPr>
+          <w:b/>
+          <w:bCs/>
+          <w:sz w:val="24"/>
+          <w:szCs w:val="24"/>
+        </w:rPr>
+      </w:pPr>
+      <w:r>
+        <w:rPr>
+          <w:sz w:val="24"/>
+          <w:szCs w:val="24"/>
+        </w:rPr>
+        <w:t>A live review meeting will be arranged (Zoom, Teams, Discord or in person)</w:t>
+      </w:r>
+    </w:p>
+    <w:p>
+      <w:pPr>
+        <w:pStyle w:val="ListParagraph"/>
+        <w:numPr>
+          <w:ilvl w:val="0"/>
+          <w:numId w:val="14"/>
+        </w:numPr>
+        <w:spacing w:before="240"/>
+        <w:rPr>
+          <w:b/>
+          <w:bCs/>
+          <w:sz w:val="24"/>
+          <w:szCs w:val="24"/>
+        </w:rPr>
+      </w:pPr>
+      <w:r>
+        <w:rPr>
+          <w:sz w:val="24"/>
+          <w:szCs w:val="24"/>
+        </w:rPr>
+        <w:t xml:space="preserve">Tackle all sections of the program (Views, Models, Controllers, </w:t>
+      </w:r>
+      <w:proofErr w:type="spellStart"/>
+      <w:r>
+        <w:rPr>
+          <w:sz w:val="24"/>
+          <w:szCs w:val="24"/>
+        </w:rPr>
+        <w:t>SeedData.cs</w:t>
+      </w:r>
+      <w:proofErr w:type="spellEnd"/>
+      <w:r>
+        <w:rPr>
+          <w:sz w:val="24"/>
+          <w:szCs w:val="24"/>
+        </w:rPr>
+        <w:t>, etc.)</w:t>
+      </w:r>
+    </w:p>
+    <w:p>
+      <w:pPr>
+        <w:pStyle w:val="ListParagraph"/>
+        <w:numPr>
+          <w:ilvl w:val="0"/>
+          <w:numId w:val="14"/>
+        </w:numPr>
+        <w:spacing w:before="240"/>
+        <w:rPr>
+          <w:b/>
+          <w:bCs/>
+          <w:sz w:val="24"/>
+          <w:szCs w:val="24"/>
+        </w:rPr>
+      </w:pPr>
+      <w:r>
+        <w:rPr>
+          <w:sz w:val="24"/>
+          <w:szCs w:val="24"/>
+        </w:rPr>
+        <w:t>Feedback will be given from the reviewer and recorded in the online form</w:t>
+      </w:r>
+    </w:p>
+    <w:p>
+      <w:pPr>
+        <w:pStyle w:val="ListParagraph"/>
+        <w:numPr>
+          <w:ilvl w:val="0"/>
+          <w:numId w:val="14"/>
+        </w:numPr>
+        <w:spacing w:before="240"/>
+        <w:rPr>
+          <w:b/>
+          <w:bCs/>
+          <w:sz w:val="24"/>
+          <w:szCs w:val="24"/>
+        </w:rPr>
+      </w:pPr>
+      <w:r>
+        <w:rPr>
+          <w:sz w:val="24"/>
+          <w:szCs w:val="24"/>
+        </w:rPr>
+        <w:t>Lastly, all review points will be summarised and noted</w:t>
+      </w:r>
+    </w:p>
+    <w:p>
+      <w:pPr>
+        <w:spacing w:before="240"/>
+        <w:rPr>
+          <w:b/>
+          <w:bCs/>
+          <w:sz w:val="24"/>
+          <w:szCs w:val="24"/>
+        </w:rPr>
+      </w:pPr>
+    </w:p>
+    <w:p>
+      <w:pPr>
+        <w:spacing w:before="240"/>
+        <w:rPr>
+          <w:b/>
+          <w:bCs/>
+          <w:sz w:val="24"/>
+          <w:szCs w:val="24"/>
+        </w:rPr>
+      </w:pPr>
+    </w:p>
+    <w:p>
+      <w:pPr>
+        <w:spacing w:before="240"/>
+        <w:rPr>
+          <w:b/>
+          <w:bCs/>
+          <w:sz w:val="24"/>
+          <w:szCs w:val="24"/>
+        </w:rPr>
+      </w:pPr>
+    </w:p>
+    <w:p>
+      <w:pPr>
+        <w:spacing w:before="240"/>
+        <w:rPr>
+          <w:b/>
+          <w:bCs/>
+          <w:sz w:val="24"/>
+          <w:szCs w:val="24"/>
+        </w:rPr>
+      </w:pPr>
+    </w:p>
+    <w:p>
+      <w:pPr>
+        <w:spacing w:before="240"/>
+        <w:rPr>
+          <w:b/>
+          <w:bCs/>
+          <w:sz w:val="24"/>
+          <w:szCs w:val="24"/>
+        </w:rPr>
+      </w:pPr>
+    </w:p>
+    <w:p>
+      <w:pPr>
+        <w:pStyle w:val="Heading1"/>
+      </w:pPr>
+      <w:r>
+        <w:lastRenderedPageBreak/>
+        <w:t>Summary of Findings</w:t>
+      </w:r>
+    </w:p>
+    <w:p/>
+    <w:p>
+      <w:pPr>
+        <w:pStyle w:val="Subtitle"/>
+        <w:rPr>
+          <w:b/>
+          <w:bCs/>
+        </w:rPr>
+      </w:pPr>
+      <w:r>
+        <w:rPr>
+          <w:b/>
+          <w:bCs/>
+        </w:rPr>
+        <w:t>Questionnaires, Non-Technical Audience</w:t>
+      </w:r>
+    </w:p>
+    <w:p/>
+    <w:p>
+      <w:r>
+        <w:drawing>
+          <wp:inline distT="0" distB="0" distL="0" distR="0" wp14:anchorId="5B9B6024" wp14:editId="06188770">
+            <wp:extent cx="5731510" cy="1748790"/>
+            <wp:effectExtent l="0" t="0" r="2540" b="3810"/>
+            <wp:docPr id="653625401" name="Picture 1"/>
+            <wp:cNvGraphicFramePr>
+              <a:graphicFrameLocks xmlns:a="http://schemas.openxmlformats.org/drawingml/2006/main" noChangeAspect="1"/>
+            </wp:cNvGraphicFramePr>
+            <a:graphic xmlns:a="http://schemas.openxmlformats.org/drawingml/2006/main">
+              <a:graphicData uri="http://schemas.openxmlformats.org/drawingml/2006/picture">
+                <pic:pic xmlns:pic="http://schemas.openxmlformats.org/drawingml/2006/picture">
+                  <pic:nvPicPr>
+                    <pic:cNvPr id="653625401" name=""/>
+                    <pic:cNvPicPr/>
+                  </pic:nvPicPr>
+                  <pic:blipFill>
+                    <a:blip r:embed="rId5"/>
+                    <a:stretch>
+                      <a:fillRect/>
+                    </a:stretch>
+                  </pic:blipFill>
+                  <pic:spPr>
+                    <a:xfrm>
+                      <a:off x="0" y="0"/>
+                      <a:ext cx="5731510" cy="1748790"/>
+                    </a:xfrm>
+                    <a:prstGeom prst="rect">
+                      <a:avLst/>
+                    </a:prstGeom>
+                  </pic:spPr>
+                </pic:pic>
+              </a:graphicData>
+            </a:graphic>
+          </wp:inline>
+        </w:drawing>
+      </w:r>
+    </w:p>
+    <w:p>
+      <w:r>
+        <w:drawing>
+          <wp:inline distT="0" distB="0" distL="0" distR="0" wp14:anchorId="5492ECCD" wp14:editId="6C8C8D12">
+            <wp:extent cx="5731510" cy="1852295"/>
+            <wp:effectExtent l="0" t="0" r="2540" b="0"/>
+            <wp:docPr id="1052287382" name="Picture 1"/>
+            <wp:cNvGraphicFramePr>
+              <a:graphicFrameLocks xmlns:a="http://schemas.openxmlformats.org/drawingml/2006/main" noChangeAspect="1"/>
+            </wp:cNvGraphicFramePr>
+            <a:graphic xmlns:a="http://schemas.openxmlformats.org/drawingml/2006/main">
+              <a:graphicData uri="http://schemas.openxmlformats.org/drawingml/2006/picture">
+                <pic:pic xmlns:pic="http://schemas.openxmlformats.org/drawingml/2006/picture">
+                  <pic:nvPicPr>
+                    <pic:cNvPr id="1052287382" name=""/>
+                    <pic:cNvPicPr/>
+                  </pic:nvPicPr>
+                  <pic:blipFill rotWithShape="1">
+                    <a:blip r:embed="rId6"/>
+                    <a:srcRect t="42031"/>
+                    <a:stretch>
+                      <a:fillRect/>
+                    </a:stretch>
+                  </pic:blipFill>
+                  <pic:spPr bwMode="auto">
+                    <a:xfrm>
+                      <a:off x="0" y="0"/>
+                      <a:ext cx="5731510" cy="1852295"/>
+                    </a:xfrm>
+                    <a:prstGeom prst="rect">
+                      <a:avLst/>
+                    </a:prstGeom>
+                    <a:ln>
+                      <a:noFill/>
+                    </a:ln>
+                    <a:extLst>
+                      <a:ext uri="{53640926-AAD7-44D8-BBD7-CCE9431645EC}">
+                        <a14:shadowObscured xmlns:a14="http://schemas.microsoft.com/office/drawing/2010/main"/>
+                      </a:ext>
+                    </a:extLst>
+                  </pic:spPr>
+                </pic:pic>
+              </a:graphicData>
+            </a:graphic>
+          </wp:inline>
+        </w:drawing>
+      </w:r>
+    </w:p>
+    <w:p/>
+    <w:p>
+      <w:pPr>
+        <w:rPr>
+          <w:noProof/>
+        </w:rPr>
+      </w:pPr>
+      <w:r>
+        <w:drawing>
+          <wp:inline distT="0" distB="0" distL="0" distR="0" wp14:anchorId="70ED7D7D" wp14:editId="5E19953A">
+            <wp:extent cx="5731510" cy="1524000"/>
+            <wp:effectExtent l="0" t="0" r="2540" b="0"/>
+            <wp:docPr id="207025270" name="Picture 1"/>
+            <wp:cNvGraphicFramePr>
+              <a:graphicFrameLocks xmlns:a="http://schemas.openxmlformats.org/drawingml/2006/main" noChangeAspect="1"/>
+            </wp:cNvGraphicFramePr>
+            <a:graphic xmlns:a="http://schemas.openxmlformats.org/drawingml/2006/main">
+              <a:graphicData uri="http://schemas.openxmlformats.org/drawingml/2006/picture">
+                <pic:pic xmlns:pic="http://schemas.openxmlformats.org/drawingml/2006/picture">
+                  <pic:nvPicPr>
+                    <pic:cNvPr id="207025270" name=""/>
+                    <pic:cNvPicPr/>
+                  </pic:nvPicPr>
+                  <pic:blipFill>
+                    <a:blip r:embed="rId7"/>
+                    <a:stretch>
+                      <a:fillRect/>
+                    </a:stretch>
+                  </pic:blipFill>
+                  <pic:spPr>
+                    <a:xfrm>
+                      <a:off x="0" y="0"/>
+                      <a:ext cx="5731510" cy="1524000"/>
+                    </a:xfrm>
+                    <a:prstGeom prst="rect">
+                      <a:avLst/>
+                    </a:prstGeom>
+                  </pic:spPr>
+                </pic:pic>
+              </a:graphicData>
+            </a:graphic>
+          </wp:inline>
+        </w:drawing>
+      </w:r>
+      <w:r>
+        <w:rPr>
+          <w:noProof/>
+        </w:rPr>
+        <w:t xml:space="preserve"> </w:t>
+      </w:r>
+      <w:r>
+        <w:drawing>
+          <wp:inline distT="0" distB="0" distL="0" distR="0" wp14:anchorId="4CFCBB7F" wp14:editId="2C37B64D">
+            <wp:extent cx="5731510" cy="1863725"/>
+            <wp:effectExtent l="0" t="0" r="2540" b="3175"/>
+            <wp:docPr id="61590695" name="Picture 1"/>
+            <wp:cNvGraphicFramePr>
+              <a:graphicFrameLocks xmlns:a="http://schemas.openxmlformats.org/drawingml/2006/main" noChangeAspect="1"/>
+            </wp:cNvGraphicFramePr>
+            <a:graphic xmlns:a="http://schemas.openxmlformats.org/drawingml/2006/main">
+              <a:graphicData uri="http://schemas.openxmlformats.org/drawingml/2006/picture">
+                <pic:pic xmlns:pic="http://schemas.openxmlformats.org/drawingml/2006/picture">
+                  <pic:nvPicPr>
+                    <pic:cNvPr id="61590695" name=""/>
+                    <pic:cNvPicPr/>
+                  </pic:nvPicPr>
+                  <pic:blipFill>
+                    <a:blip r:embed="rId8"/>
+                    <a:stretch>
+                      <a:fillRect/>
+                    </a:stretch>
+                  </pic:blipFill>
+                  <pic:spPr>
+                    <a:xfrm>
+                      <a:off x="0" y="0"/>
+                      <a:ext cx="5731510" cy="1863725"/>
+                    </a:xfrm>
+                    <a:prstGeom prst="rect">
+                      <a:avLst/>
+                    </a:prstGeom>
+                  </pic:spPr>
+                </pic:pic>
+              </a:graphicData>
+            </a:graphic>
+          </wp:inline>
+        </w:drawing>
+      </w:r>
+    </w:p>
+    <w:p>
+      <w:pPr>
+        <w:rPr>
+          <w:rtl/>
+          <w:lang w:bidi="ar-EG"/>
+        </w:rPr>
+      </w:pPr>
+      <w:r>
+        <w:rPr>
+          <w:lang w:bidi="ar-EG"/>
+        </w:rPr>
+        <w:lastRenderedPageBreak/>
+        <w:drawing>
+          <wp:inline distT="0" distB="0" distL="0" distR="0" wp14:anchorId="4291FF4F" wp14:editId="1294DCEB">
+            <wp:extent cx="5731510" cy="2042795"/>
+            <wp:effectExtent l="0" t="0" r="2540" b="0"/>
+            <wp:docPr id="195039444" name="Picture 1"/>
+            <wp:cNvGraphicFramePr>
+              <a:graphicFrameLocks xmlns:a="http://schemas.openxmlformats.org/drawingml/2006/main" noChangeAspect="1"/>
+            </wp:cNvGraphicFramePr>
+            <a:graphic xmlns:a="http://schemas.openxmlformats.org/drawingml/2006/main">
+              <a:graphicData uri="http://schemas.openxmlformats.org/drawingml/2006/picture">
+                <pic:pic xmlns:pic="http://schemas.openxmlformats.org/drawingml/2006/picture">
+                  <pic:nvPicPr>
+                    <pic:cNvPr id="195039444" name=""/>
+                    <pic:cNvPicPr/>
+                  </pic:nvPicPr>
+                  <pic:blipFill>
+                    <a:blip r:embed="rId9"/>
+                    <a:stretch>
+                      <a:fillRect/>
+                    </a:stretch>
+                  </pic:blipFill>
+                  <pic:spPr>
+                    <a:xfrm>
+                      <a:off x="0" y="0"/>
+                      <a:ext cx="5731510" cy="2042795"/>
+                    </a:xfrm>
+                    <a:prstGeom prst="rect">
+                      <a:avLst/>
+                    </a:prstGeom>
+                  </pic:spPr>
+                </pic:pic>
+              </a:graphicData>
+            </a:graphic>
+          </wp:inline>
+        </w:drawing>
+      </w:r>
+    </w:p>
+    <w:p>
+      <w:pPr>
+        <w:rPr>
+          <w:rtl/>
+          <w:lang w:bidi="ar-EG"/>
+        </w:rPr>
+      </w:pPr>
+      <w:r>
+        <w:rPr>
+          <w:lang w:bidi="ar-EG"/>
+        </w:rPr>
+        <w:drawing>
+          <wp:inline distT="0" distB="0" distL="0" distR="0" wp14:anchorId="1BE18982" wp14:editId="595CB4A4">
+            <wp:extent cx="5731510" cy="1986915"/>
+            <wp:effectExtent l="0" t="0" r="2540" b="0"/>
+            <wp:docPr id="1570833675" name="Picture 1"/>
+            <wp:cNvGraphicFramePr>
+              <a:graphicFrameLocks xmlns:a="http://schemas.openxmlformats.org/drawingml/2006/main" noChangeAspect="1"/>
+            </wp:cNvGraphicFramePr>
+            <a:graphic xmlns:a="http://schemas.openxmlformats.org/drawingml/2006/main">
+              <a:graphicData uri="http://schemas.openxmlformats.org/drawingml/2006/picture">
+                <pic:pic xmlns:pic="http://schemas.openxmlformats.org/drawingml/2006/picture">
+                  <pic:nvPicPr>
+                    <pic:cNvPr id="1570833675" name=""/>
+                    <pic:cNvPicPr/>
+                  </pic:nvPicPr>
+                  <pic:blipFill>
+                    <a:blip r:embed="rId10"/>
+                    <a:stretch>
+                      <a:fillRect/>
+                    </a:stretch>
+                  </pic:blipFill>
+                  <pic:spPr>
+                    <a:xfrm>
+                      <a:off x="0" y="0"/>
+                      <a:ext cx="5731510" cy="1986915"/>
+                    </a:xfrm>
+                    <a:prstGeom prst="rect">
+                      <a:avLst/>
+                    </a:prstGeom>
+                  </pic:spPr>
+                </pic:pic>
+              </a:graphicData>
+            </a:graphic>
+          </wp:inline>
+        </w:drawing>
+      </w:r>
+    </w:p>
+    <w:p>
+      <w:pPr>
+        <w:rPr>
+          <w:rtl/>
+          <w:lang w:bidi="ar-EG"/>
+        </w:rPr>
+      </w:pPr>
+      <w:r>
+        <w:rPr>
+          <w:lang w:bidi="ar-EG"/>
+        </w:rPr>
+        <w:drawing>
+          <wp:inline distT="0" distB="0" distL="0" distR="0" wp14:anchorId="2984D53C" wp14:editId="5FBE071C">
+            <wp:extent cx="5731510" cy="1704340"/>
+            <wp:effectExtent l="0" t="0" r="2540" b="0"/>
+            <wp:docPr id="1310924525" name="Picture 1"/>
+            <wp:cNvGraphicFramePr>
+              <a:graphicFrameLocks xmlns:a="http://schemas.openxmlformats.org/drawingml/2006/main" noChangeAspect="1"/>
+            </wp:cNvGraphicFramePr>
+            <a:graphic xmlns:a="http://schemas.openxmlformats.org/drawingml/2006/main">
+              <a:graphicData uri="http://schemas.openxmlformats.org/drawingml/2006/picture">
+                <pic:pic xmlns:pic="http://schemas.openxmlformats.org/drawingml/2006/picture">
+                  <pic:nvPicPr>
+                    <pic:cNvPr id="1310924525" name=""/>
+                    <pic:cNvPicPr/>
+                  </pic:nvPicPr>
+                  <pic:blipFill>
+                    <a:blip r:embed="rId11"/>
+                    <a:stretch>
+                      <a:fillRect/>
+                    </a:stretch>
+                  </pic:blipFill>
+                  <pic:spPr>
+                    <a:xfrm>
+                      <a:off x="0" y="0"/>
+                      <a:ext cx="5731510" cy="1704340"/>
+                    </a:xfrm>
+                    <a:prstGeom prst="rect">
+                      <a:avLst/>
+                    </a:prstGeom>
+                  </pic:spPr>
+                </pic:pic>
+              </a:graphicData>
+            </a:graphic>
+          </wp:inline>
+        </w:drawing>
+      </w:r>
+    </w:p>
+    <w:p>
+      <w:pPr>
+        <w:rPr>
+          <w:rtl/>
+          <w:lang w:bidi="ar-EG"/>
+        </w:rPr>
+      </w:pPr>
+      <w:r>
+        <w:rPr>
+          <w:lang w:bidi="ar-EG"/>
+        </w:rPr>
+        <w:drawing>
+          <wp:inline distT="0" distB="0" distL="0" distR="0" wp14:anchorId="7372AE03" wp14:editId="08AEBCAB">
+            <wp:extent cx="5731510" cy="1828165"/>
+            <wp:effectExtent l="0" t="0" r="2540" b="635"/>
+            <wp:docPr id="784212498" name="Picture 1"/>
+            <wp:cNvGraphicFramePr>
+              <a:graphicFrameLocks xmlns:a="http://schemas.openxmlformats.org/drawingml/2006/main" noChangeAspect="1"/>
+            </wp:cNvGraphicFramePr>
+            <a:graphic xmlns:a="http://schemas.openxmlformats.org/drawingml/2006/main">
+              <a:graphicData uri="http://schemas.openxmlformats.org/drawingml/2006/picture">
+                <pic:pic xmlns:pic="http://schemas.openxmlformats.org/drawingml/2006/picture">
+                  <pic:nvPicPr>
+                    <pic:cNvPr id="784212498" name=""/>
+                    <pic:cNvPicPr/>
+                  </pic:nvPicPr>
+                  <pic:blipFill>
+                    <a:blip r:embed="rId12"/>
+                    <a:stretch>
+                      <a:fillRect/>
+                    </a:stretch>
+                  </pic:blipFill>
+                  <pic:spPr>
+                    <a:xfrm>
+                      <a:off x="0" y="0"/>
+                      <a:ext cx="5731510" cy="1828165"/>
+                    </a:xfrm>
+                    <a:prstGeom prst="rect">
+                      <a:avLst/>
+                    </a:prstGeom>
+                  </pic:spPr>
+                </pic:pic>
+              </a:graphicData>
+            </a:graphic>
+          </wp:inline>
+        </w:drawing>
+      </w:r>
+    </w:p>
+    <w:p>
+      <w:pPr>
+        <w:rPr>
+          <w:rtl/>
+          <w:lang w:bidi="ar-EG"/>
+        </w:rPr>
+      </w:pPr>
+      <w:r>
+        <w:rPr>
+          <w:lang w:bidi="ar-EG"/>
+        </w:rPr>
+        <w:lastRenderedPageBreak/>
+        <w:drawing>
+          <wp:inline distT="0" distB="0" distL="0" distR="0" wp14:anchorId="2107398A" wp14:editId="73D68411">
+            <wp:extent cx="5731510" cy="1557020"/>
+            <wp:effectExtent l="0" t="0" r="2540" b="5080"/>
+            <wp:docPr id="26193374" name="Picture 1"/>
+            <wp:cNvGraphicFramePr>
+              <a:graphicFrameLocks xmlns:a="http://schemas.openxmlformats.org/drawingml/2006/main" noChangeAspect="1"/>
+            </wp:cNvGraphicFramePr>
+            <a:graphic xmlns:a="http://schemas.openxmlformats.org/drawingml/2006/main">
+              <a:graphicData uri="http://schemas.openxmlformats.org/drawingml/2006/picture">
+                <pic:pic xmlns:pic="http://schemas.openxmlformats.org/drawingml/2006/picture">
+                  <pic:nvPicPr>
+                    <pic:cNvPr id="26193374" name=""/>
+                    <pic:cNvPicPr/>
+                  </pic:nvPicPr>
+                  <pic:blipFill>
+                    <a:blip r:embed="rId13"/>
+                    <a:stretch>
+                      <a:fillRect/>
+                    </a:stretch>
+                  </pic:blipFill>
+                  <pic:spPr>
+                    <a:xfrm>
+                      <a:off x="0" y="0"/>
+                      <a:ext cx="5731510" cy="1557020"/>
+                    </a:xfrm>
+                    <a:prstGeom prst="rect">
+                      <a:avLst/>
+                    </a:prstGeom>
+                  </pic:spPr>
+                </pic:pic>
+              </a:graphicData>
+            </a:graphic>
+          </wp:inline>
+        </w:drawing>
+      </w:r>
+    </w:p>
+    <w:p>
+      <w:pPr>
+        <w:rPr>
+          <w:rtl/>
+          <w:lang w:bidi="ar-EG"/>
+        </w:rPr>
+      </w:pPr>
+      <w:r>
+        <w:rPr>
+          <w:lang w:bidi="ar-EG"/>
+        </w:rPr>
+        <w:drawing>
+          <wp:inline distT="0" distB="0" distL="0" distR="0" wp14:anchorId="6FF96200" wp14:editId="058DFBC5">
+            <wp:extent cx="5731510" cy="1758315"/>
+            <wp:effectExtent l="0" t="0" r="2540" b="0"/>
+            <wp:docPr id="287362085" name="Picture 1"/>
+            <wp:cNvGraphicFramePr>
+              <a:graphicFrameLocks xmlns:a="http://schemas.openxmlformats.org/drawingml/2006/main" noChangeAspect="1"/>
+            </wp:cNvGraphicFramePr>
+            <a:graphic xmlns:a="http://schemas.openxmlformats.org/drawingml/2006/main">
+              <a:graphicData uri="http://schemas.openxmlformats.org/drawingml/2006/picture">
+                <pic:pic xmlns:pic="http://schemas.openxmlformats.org/drawingml/2006/picture">
+                  <pic:nvPicPr>
+                    <pic:cNvPr id="287362085" name=""/>
+                    <pic:cNvPicPr/>
+                  </pic:nvPicPr>
+                  <pic:blipFill>
+                    <a:blip r:embed="rId14"/>
+                    <a:stretch>
+                      <a:fillRect/>
+                    </a:stretch>
+                  </pic:blipFill>
+                  <pic:spPr>
+                    <a:xfrm>
+                      <a:off x="0" y="0"/>
+                      <a:ext cx="5731510" cy="1758315"/>
+                    </a:xfrm>
+                    <a:prstGeom prst="rect">
+                      <a:avLst/>
+                    </a:prstGeom>
+                  </pic:spPr>
+                </pic:pic>
+              </a:graphicData>
+            </a:graphic>
+          </wp:inline>
+        </w:drawing>
+      </w:r>
+    </w:p>
+    <w:p>
+      <w:pPr>
+        <w:rPr>
+          <w:rtl/>
+          <w:lang w:bidi="ar-EG"/>
+        </w:rPr>
+      </w:pPr>
+      <w:r>
+        <w:rPr>
+          <w:lang w:bidi="ar-EG"/>
+        </w:rPr>
+        <w:drawing>
+          <wp:inline distT="0" distB="0" distL="0" distR="0" wp14:anchorId="560152FD" wp14:editId="152F2011">
+            <wp:extent cx="5731510" cy="2336165"/>
+            <wp:effectExtent l="0" t="0" r="2540" b="6985"/>
+            <wp:docPr id="1470602886" name="Picture 1"/>
+            <wp:cNvGraphicFramePr>
+              <a:graphicFrameLocks xmlns:a="http://schemas.openxmlformats.org/drawingml/2006/main" noChangeAspect="1"/>
+            </wp:cNvGraphicFramePr>
+            <a:graphic xmlns:a="http://schemas.openxmlformats.org/drawingml/2006/main">
+              <a:graphicData uri="http://schemas.openxmlformats.org/drawingml/2006/picture">
+                <pic:pic xmlns:pic="http://schemas.openxmlformats.org/drawingml/2006/picture">
+                  <pic:nvPicPr>
+                    <pic:cNvPr id="1470602886" name=""/>
+                    <pic:cNvPicPr/>
+                  </pic:nvPicPr>
+                  <pic:blipFill>
+                    <a:blip r:embed="rId15"/>
+                    <a:stretch>
+                      <a:fillRect/>
+                    </a:stretch>
+                  </pic:blipFill>
+                  <pic:spPr>
+                    <a:xfrm>
+                      <a:off x="0" y="0"/>
+                      <a:ext cx="5731510" cy="2336165"/>
+                    </a:xfrm>
+                    <a:prstGeom prst="rect">
+                      <a:avLst/>
+                    </a:prstGeom>
+                  </pic:spPr>
+                </pic:pic>
+              </a:graphicData>
+            </a:graphic>
+          </wp:inline>
+        </w:drawing>
+      </w:r>
+    </w:p>
+    <w:p>
+      <w:pPr>
+        <w:rPr>
+          <w:rtl/>
+          <w:lang w:bidi="ar-EG"/>
+        </w:rPr>
+      </w:pPr>
+    </w:p>
+    <w:p>
+      <w:pPr>
+        <w:rPr>
+          <w:rtl/>
+          <w:lang w:bidi="ar-EG"/>
+        </w:rPr>
+      </w:pPr>
+    </w:p>
+    <w:p>
+      <w:pPr>
+        <w:rPr>
+          <w:rtl/>
+          <w:lang w:bidi="ar-EG"/>
+        </w:rPr>
+      </w:pPr>
+    </w:p>
+    <w:p>
+      <w:pPr>
+        <w:rPr>
+          <w:rtl/>
+          <w:lang w:bidi="ar-EG"/>
+        </w:rPr>
+      </w:pPr>
+    </w:p>
+    <w:p>
+      <w:pPr>
+        <w:rPr>
+          <w:rtl/>
+          <w:lang w:bidi="ar-EG"/>
+        </w:rPr>
+      </w:pPr>
+    </w:p>
+    <w:p>
+      <w:pPr>
+        <w:rPr>
+          <w:rtl/>
+          <w:lang w:bidi="ar-EG"/>
+        </w:rPr>
+      </w:pPr>
+    </w:p>
+    <w:p>
+      <w:pPr>
+        <w:rPr>
+          <w:rtl/>
+          <w:lang w:bidi="ar-EG"/>
+        </w:rPr>
+      </w:pPr>
+    </w:p>
+    <w:p>
+      <w:pPr>
+        <w:rPr>
+          <w:rtl/>
+          <w:lang w:bidi="ar-EG"/>
+        </w:rPr>
+      </w:pPr>
+    </w:p>
+    <w:p>
+      <w:pPr>
+        <w:rPr>
+          <w:rtl/>
+          <w:lang w:bidi="ar-EG"/>
+        </w:rPr>
+      </w:pPr>
+    </w:p>
+    <w:p>
+      <w:pPr>
+        <w:rPr>
+          <w:rtl/>
+          <w:lang w:bidi="ar-EG"/>
+        </w:rPr>
+      </w:pPr>
+    </w:p>
+    <w:p>
+      <w:pPr>
+        <w:pStyle w:val="Subtitle"/>
+        <w:rPr>
+          <w:b/>
+          <w:bCs/>
+        </w:rPr>
+      </w:pPr>
+      <w:r>
+        <w:rPr>
+          <w:b/>
+          <w:bCs/>
+        </w:rPr>
+        <w:lastRenderedPageBreak/>
+        <w:t>Paired Coding Reviews, Technical Audience</w:t>
+      </w:r>
+    </w:p>
+    <w:p>
+      <w:pPr>
+        <w:rPr>
+          <w:rtl/>
+          <w:lang w:bidi="ar-EG"/>
+        </w:rPr>
+      </w:pPr>
+      <w:r>
+        <w:rPr>
+          <w:lang w:bidi="ar-EG"/>
+        </w:rPr>
+        <w:drawing>
+          <wp:inline distT="0" distB="0" distL="0" distR="0" wp14:anchorId="4368BBB7" wp14:editId="71B8D164">
+            <wp:extent cx="5731510" cy="1734820"/>
+            <wp:effectExtent l="0" t="0" r="2540" b="0"/>
+            <wp:docPr id="1335055721" name="Picture 1"/>
+            <wp:cNvGraphicFramePr>
+              <a:graphicFrameLocks xmlns:a="http://schemas.openxmlformats.org/drawingml/2006/main" noChangeAspect="1"/>
+            </wp:cNvGraphicFramePr>
+            <a:graphic xmlns:a="http://schemas.openxmlformats.org/drawingml/2006/main">
+              <a:graphicData uri="http://schemas.openxmlformats.org/drawingml/2006/picture">
+                <pic:pic xmlns:pic="http://schemas.openxmlformats.org/drawingml/2006/picture">
+                  <pic:nvPicPr>
+                    <pic:cNvPr id="1335055721" name=""/>
+                    <pic:cNvPicPr/>
+                  </pic:nvPicPr>
+                  <pic:blipFill>
+                    <a:blip r:embed="rId16"/>
+                    <a:stretch>
+                      <a:fillRect/>
+                    </a:stretch>
+                  </pic:blipFill>
+                  <pic:spPr>
+                    <a:xfrm>
+                      <a:off x="0" y="0"/>
+                      <a:ext cx="5731510" cy="1734820"/>
+                    </a:xfrm>
+                    <a:prstGeom prst="rect">
+                      <a:avLst/>
+                    </a:prstGeom>
+                  </pic:spPr>
+                </pic:pic>
+              </a:graphicData>
+            </a:graphic>
+          </wp:inline>
+        </w:drawing>
+      </w:r>
+    </w:p>
+    <w:p>
+      <w:pPr>
+        <w:rPr>
+          <w:rtl/>
+          <w:lang w:bidi="ar-EG"/>
+        </w:rPr>
+      </w:pPr>
+      <w:r>
+        <w:rPr>
+          <w:lang w:bidi="ar-EG"/>
+        </w:rPr>
+        <w:drawing>
+          <wp:inline distT="0" distB="0" distL="0" distR="0" wp14:anchorId="6A0E46BF" wp14:editId="798BD23A">
+            <wp:extent cx="5731510" cy="1640840"/>
+            <wp:effectExtent l="0" t="0" r="2540" b="0"/>
+            <wp:docPr id="1649089868" name="Picture 1"/>
+            <wp:cNvGraphicFramePr>
+              <a:graphicFrameLocks xmlns:a="http://schemas.openxmlformats.org/drawingml/2006/main" noChangeAspect="1"/>
+            </wp:cNvGraphicFramePr>
+            <a:graphic xmlns:a="http://schemas.openxmlformats.org/drawingml/2006/main">
+              <a:graphicData uri="http://schemas.openxmlformats.org/drawingml/2006/picture">
+                <pic:pic xmlns:pic="http://schemas.openxmlformats.org/drawingml/2006/picture">
+                  <pic:nvPicPr>
+                    <pic:cNvPr id="1649089868" name=""/>
+                    <pic:cNvPicPr/>
+                  </pic:nvPicPr>
+                  <pic:blipFill>
+                    <a:blip r:embed="rId17"/>
+                    <a:stretch>
+                      <a:fillRect/>
+                    </a:stretch>
+                  </pic:blipFill>
+                  <pic:spPr>
+                    <a:xfrm>
+                      <a:off x="0" y="0"/>
+                      <a:ext cx="5731510" cy="1640840"/>
+                    </a:xfrm>
+                    <a:prstGeom prst="rect">
+                      <a:avLst/>
+                    </a:prstGeom>
+                  </pic:spPr>
+                </pic:pic>
+              </a:graphicData>
+            </a:graphic>
+          </wp:inline>
+        </w:drawing>
+      </w:r>
+    </w:p>
+    <w:p>
+      <w:pPr>
+        <w:rPr>
+          <w:rtl/>
+          <w:lang w:bidi="ar-EG"/>
+        </w:rPr>
+      </w:pPr>
+      <w:r>
+        <w:rPr>
+          <w:lang w:bidi="ar-EG"/>
+        </w:rPr>
+        <w:drawing>
+          <wp:inline distT="0" distB="0" distL="0" distR="0" wp14:anchorId="4707D92C" wp14:editId="12B4EE46">
+            <wp:extent cx="5731510" cy="1500505"/>
+            <wp:effectExtent l="0" t="0" r="2540" b="4445"/>
+            <wp:docPr id="650645941" name="Picture 1"/>
+            <wp:cNvGraphicFramePr>
+              <a:graphicFrameLocks xmlns:a="http://schemas.openxmlformats.org/drawingml/2006/main" noChangeAspect="1"/>
+            </wp:cNvGraphicFramePr>
+            <a:graphic xmlns:a="http://schemas.openxmlformats.org/drawingml/2006/main">
+              <a:graphicData uri="http://schemas.openxmlformats.org/drawingml/2006/picture">
+                <pic:pic xmlns:pic="http://schemas.openxmlformats.org/drawingml/2006/picture">
+                  <pic:nvPicPr>
+                    <pic:cNvPr id="650645941" name=""/>
+                    <pic:cNvPicPr/>
+                  </pic:nvPicPr>
+                  <pic:blipFill>
+                    <a:blip r:embed="rId18"/>
+                    <a:stretch>
+                      <a:fillRect/>
+                    </a:stretch>
+                  </pic:blipFill>
+                  <pic:spPr>
+                    <a:xfrm>
+                      <a:off x="0" y="0"/>
+                      <a:ext cx="5731510" cy="1500505"/>
+                    </a:xfrm>
+                    <a:prstGeom prst="rect">
+                      <a:avLst/>
+                    </a:prstGeom>
+                  </pic:spPr>
+                </pic:pic>
+              </a:graphicData>
+            </a:graphic>
+          </wp:inline>
+        </w:drawing>
+      </w:r>
+    </w:p>
+    <w:p>
+      <w:pPr>
+        <w:rPr>
+          <w:rtl/>
+          <w:lang w:bidi="ar-EG"/>
+        </w:rPr>
+      </w:pPr>
+      <w:r>
+        <w:rPr>
+          <w:lang w:bidi="ar-EG"/>
+        </w:rPr>
+        <w:lastRenderedPageBreak/>
+        <w:drawing>
+          <wp:inline distT="0" distB="0" distL="0" distR="0" wp14:anchorId="69EA6B86" wp14:editId="6645D49B">
+            <wp:extent cx="5731510" cy="5775960"/>
+            <wp:effectExtent l="0" t="0" r="2540" b="0"/>
+            <wp:docPr id="806018186" name="Picture 1"/>
+            <wp:cNvGraphicFramePr>
+              <a:graphicFrameLocks xmlns:a="http://schemas.openxmlformats.org/drawingml/2006/main" noChangeAspect="1"/>
+            </wp:cNvGraphicFramePr>
+            <a:graphic xmlns:a="http://schemas.openxmlformats.org/drawingml/2006/main">
+              <a:graphicData uri="http://schemas.openxmlformats.org/drawingml/2006/picture">
+                <pic:pic xmlns:pic="http://schemas.openxmlformats.org/drawingml/2006/picture">
+                  <pic:nvPicPr>
+                    <pic:cNvPr id="806018186" name=""/>
+                    <pic:cNvPicPr/>
+                  </pic:nvPicPr>
+                  <pic:blipFill>
+                    <a:blip r:embed="rId19"/>
+                    <a:stretch>
+                      <a:fillRect/>
+                    </a:stretch>
+                  </pic:blipFill>
+                  <pic:spPr>
+                    <a:xfrm>
+                      <a:off x="0" y="0"/>
+                      <a:ext cx="5731510" cy="5775960"/>
+                    </a:xfrm>
+                    <a:prstGeom prst="rect">
+                      <a:avLst/>
+                    </a:prstGeom>
+                  </pic:spPr>
+                </pic:pic>
+              </a:graphicData>
+            </a:graphic>
+          </wp:inline>
+        </w:drawing>
+      </w:r>
+    </w:p>
+    <w:p>
+      <w:pPr>
+        <w:rPr>
+          <w:rtl/>
+          <w:lang w:bidi="ar-EG"/>
+        </w:rPr>
+      </w:pPr>
+    </w:p>
+    <w:p>
+      <w:pPr>
+        <w:rPr>
+          <w:rtl/>
+          <w:lang w:bidi="ar-EG"/>
+        </w:rPr>
+      </w:pPr>
+      <w:r>
+        <w:rPr>
+          <w:lang w:bidi="ar-EG"/>
+        </w:rPr>
+        <w:drawing>
+          <wp:inline distT="0" distB="0" distL="0" distR="0" wp14:anchorId="580ED245" wp14:editId="7CAF535A">
+            <wp:extent cx="5731510" cy="1736090"/>
+            <wp:effectExtent l="0" t="0" r="2540" b="0"/>
+            <wp:docPr id="1131375316" name="Picture 1"/>
+            <wp:cNvGraphicFramePr>
+              <a:graphicFrameLocks xmlns:a="http://schemas.openxmlformats.org/drawingml/2006/main" noChangeAspect="1"/>
+            </wp:cNvGraphicFramePr>
+            <a:graphic xmlns:a="http://schemas.openxmlformats.org/drawingml/2006/main">
+              <a:graphicData uri="http://schemas.openxmlformats.org/drawingml/2006/picture">
+                <pic:pic xmlns:pic="http://schemas.openxmlformats.org/drawingml/2006/picture">
+                  <pic:nvPicPr>
+                    <pic:cNvPr id="1131375316" name=""/>
+                    <pic:cNvPicPr/>
+                  </pic:nvPicPr>
+                  <pic:blipFill>
+                    <a:blip r:embed="rId20"/>
+                    <a:stretch>
+                      <a:fillRect/>
+                    </a:stretch>
+                  </pic:blipFill>
+                  <pic:spPr>
+                    <a:xfrm>
+                      <a:off x="0" y="0"/>
+                      <a:ext cx="5731510" cy="1736090"/>
+                    </a:xfrm>
+                    <a:prstGeom prst="rect">
+                      <a:avLst/>
+                    </a:prstGeom>
+                  </pic:spPr>
+                </pic:pic>
+              </a:graphicData>
+            </a:graphic>
+          </wp:inline>
+        </w:drawing>
+      </w:r>
+    </w:p>
+    <w:p>
+      <w:pPr>
+        <w:rPr>
+          <w:rtl/>
+          <w:lang w:bidi="ar-EG"/>
+        </w:rPr>
+      </w:pPr>
+      <w:r>
+        <w:rPr>
+          <w:lang w:bidi="ar-EG"/>
+        </w:rPr>
+        <w:lastRenderedPageBreak/>
+        <w:drawing>
+          <wp:inline distT="0" distB="0" distL="0" distR="0" wp14:anchorId="2BE634A2" wp14:editId="28B38E8E">
+            <wp:extent cx="5731510" cy="1497330"/>
+            <wp:effectExtent l="0" t="0" r="2540" b="7620"/>
+            <wp:docPr id="1597895911" name="Picture 1"/>
+            <wp:cNvGraphicFramePr>
+              <a:graphicFrameLocks xmlns:a="http://schemas.openxmlformats.org/drawingml/2006/main" noChangeAspect="1"/>
+            </wp:cNvGraphicFramePr>
+            <a:graphic xmlns:a="http://schemas.openxmlformats.org/drawingml/2006/main">
+              <a:graphicData uri="http://schemas.openxmlformats.org/drawingml/2006/picture">
+                <pic:pic xmlns:pic="http://schemas.openxmlformats.org/drawingml/2006/picture">
+                  <pic:nvPicPr>
+                    <pic:cNvPr id="1597895911" name=""/>
+                    <pic:cNvPicPr/>
+                  </pic:nvPicPr>
+                  <pic:blipFill>
+                    <a:blip r:embed="rId21"/>
+                    <a:stretch>
+                      <a:fillRect/>
+                    </a:stretch>
+                  </pic:blipFill>
+                  <pic:spPr>
+                    <a:xfrm>
+                      <a:off x="0" y="0"/>
+                      <a:ext cx="5731510" cy="1497330"/>
+                    </a:xfrm>
+                    <a:prstGeom prst="rect">
+                      <a:avLst/>
+                    </a:prstGeom>
+                  </pic:spPr>
+                </pic:pic>
+              </a:graphicData>
+            </a:graphic>
+          </wp:inline>
+        </w:drawing>
+      </w:r>
+    </w:p>
+    <w:p>
+      <w:pPr>
+        <w:rPr>
+          <w:rtl/>
+          <w:lang w:bidi="ar-EG"/>
+        </w:rPr>
+      </w:pPr>
+      <w:r>
+        <w:rPr>
+          <w:lang w:bidi="ar-EG"/>
+        </w:rPr>
+        <w:drawing>
+          <wp:inline distT="0" distB="0" distL="0" distR="0" wp14:anchorId="12CD08CE" wp14:editId="794E9714">
+            <wp:extent cx="5731510" cy="1426210"/>
+            <wp:effectExtent l="0" t="0" r="2540" b="2540"/>
+            <wp:docPr id="1451232082" name="Picture 1"/>
+            <wp:cNvGraphicFramePr>
+              <a:graphicFrameLocks xmlns:a="http://schemas.openxmlformats.org/drawingml/2006/main" noChangeAspect="1"/>
+            </wp:cNvGraphicFramePr>
+            <a:graphic xmlns:a="http://schemas.openxmlformats.org/drawingml/2006/main">
+              <a:graphicData uri="http://schemas.openxmlformats.org/drawingml/2006/picture">
+                <pic:pic xmlns:pic="http://schemas.openxmlformats.org/drawingml/2006/picture">
+                  <pic:nvPicPr>
+                    <pic:cNvPr id="1451232082" name=""/>
+                    <pic:cNvPicPr/>
+                  </pic:nvPicPr>
+                  <pic:blipFill>
+                    <a:blip r:embed="rId22"/>
+                    <a:stretch>
+                      <a:fillRect/>
+                    </a:stretch>
+                  </pic:blipFill>
+                  <pic:spPr>
+                    <a:xfrm>
+                      <a:off x="0" y="0"/>
+                      <a:ext cx="5731510" cy="1426210"/>
+                    </a:xfrm>
+                    <a:prstGeom prst="rect">
+                      <a:avLst/>
+                    </a:prstGeom>
+                  </pic:spPr>
+                </pic:pic>
+              </a:graphicData>
+            </a:graphic>
+          </wp:inline>
+        </w:drawing>
+      </w:r>
+    </w:p>
+    <w:p>
+      <w:pPr>
+        <w:rPr>
+          <w:rtl/>
+          <w:lang w:bidi="ar-EG"/>
+        </w:rPr>
+      </w:pPr>
+      <w:r>
+        <w:rPr>
+          <w:lang w:bidi="ar-EG"/>
+        </w:rPr>
+        <w:drawing>
+          <wp:inline distT="0" distB="0" distL="0" distR="0" wp14:anchorId="7A223A13" wp14:editId="5AE9C4E0">
+            <wp:extent cx="5731510" cy="1539875"/>
+            <wp:effectExtent l="0" t="0" r="2540" b="3175"/>
+            <wp:docPr id="156256470" name="Picture 1"/>
+            <wp:cNvGraphicFramePr>
+              <a:graphicFrameLocks xmlns:a="http://schemas.openxmlformats.org/drawingml/2006/main" noChangeAspect="1"/>
+            </wp:cNvGraphicFramePr>
+            <a:graphic xmlns:a="http://schemas.openxmlformats.org/drawingml/2006/main">
+              <a:graphicData uri="http://schemas.openxmlformats.org/drawingml/2006/picture">
+                <pic:pic xmlns:pic="http://schemas.openxmlformats.org/drawingml/2006/picture">
+                  <pic:nvPicPr>
+                    <pic:cNvPr id="156256470" name=""/>
+                    <pic:cNvPicPr/>
+                  </pic:nvPicPr>
+                  <pic:blipFill>
+                    <a:blip r:embed="rId23"/>
+                    <a:stretch>
+                      <a:fillRect/>
+                    </a:stretch>
+                  </pic:blipFill>
+                  <pic:spPr>
+                    <a:xfrm>
+                      <a:off x="0" y="0"/>
+                      <a:ext cx="5731510" cy="1539875"/>
+                    </a:xfrm>
+                    <a:prstGeom prst="rect">
+                      <a:avLst/>
+                    </a:prstGeom>
+                  </pic:spPr>
+                </pic:pic>
+              </a:graphicData>
+            </a:graphic>
+          </wp:inline>
+        </w:drawing>
+      </w:r>
+    </w:p>
+    <w:p>
+      <w:pPr>
+        <w:rPr>
+          <w:rFonts w:hint="cs"/>
+          <w:rtl/>
+          <w:lang w:bidi="ar-EG"/>
+        </w:rPr>
+      </w:pPr>
+      <w:r>
+        <w:rPr>
+          <w:lang w:bidi="ar-EG"/>
+        </w:rPr>
+        <w:drawing>
+          <wp:inline distT="0" distB="0" distL="0" distR="0" wp14:anchorId="1890ACAD" wp14:editId="421BE3F0">
+            <wp:extent cx="5731510" cy="2122170"/>
+            <wp:effectExtent l="0" t="0" r="2540" b="0"/>
+            <wp:docPr id="1933993515" name="Picture 1"/>
+            <wp:cNvGraphicFramePr>
+              <a:graphicFrameLocks xmlns:a="http://schemas.openxmlformats.org/drawingml/2006/main" noChangeAspect="1"/>
+            </wp:cNvGraphicFramePr>
+            <a:graphic xmlns:a="http://schemas.openxmlformats.org/drawingml/2006/main">
+              <a:graphicData uri="http://schemas.openxmlformats.org/drawingml/2006/picture">
+                <pic:pic xmlns:pic="http://schemas.openxmlformats.org/drawingml/2006/picture">
+                  <pic:nvPicPr>
+                    <pic:cNvPr id="1933993515" name=""/>
+                    <pic:cNvPicPr/>
+                  </pic:nvPicPr>
+                  <pic:blipFill>
+                    <a:blip r:embed="rId24"/>
+                    <a:stretch>
+                      <a:fillRect/>
+                    </a:stretch>
+                  </pic:blipFill>
+                  <pic:spPr>
+                    <a:xfrm>
+                      <a:off x="0" y="0"/>
+                      <a:ext cx="5731510" cy="2122170"/>
+                    </a:xfrm>
+                    <a:prstGeom prst="rect">
+                      <a:avLst/>
+                    </a:prstGeom>
+                  </pic:spPr>
+                </pic:pic>
+              </a:graphicData>
+            </a:graphic>
+          </wp:inline>
+        </w:drawing>
+      </w:r>
+      <w:r>
+        <w:rPr>
+          <w:noProof/>
+        </w:rPr>
+        <w:t xml:space="preserve"> </w:t>
+      </w:r>
+      <w:r>
+        <w:rPr>
+          <w:lang w:bidi="ar-EG"/>
+        </w:rPr>
+        <w:drawing>
+          <wp:inline distT="0" distB="0" distL="0" distR="0" wp14:anchorId="1FB31F0F" wp14:editId="7FB97BC5">
+            <wp:extent cx="5731510" cy="1510665"/>
+            <wp:effectExtent l="0" t="0" r="2540" b="0"/>
+            <wp:docPr id="333358588" name="Picture 1"/>
+            <wp:cNvGraphicFramePr>
+              <a:graphicFrameLocks xmlns:a="http://schemas.openxmlformats.org/drawingml/2006/main" noChangeAspect="1"/>
+            </wp:cNvGraphicFramePr>
+            <a:graphic xmlns:a="http://schemas.openxmlformats.org/drawingml/2006/main">
+              <a:graphicData uri="http://schemas.openxmlformats.org/drawingml/2006/picture">
+                <pic:pic xmlns:pic="http://schemas.openxmlformats.org/drawingml/2006/picture">
+                  <pic:nvPicPr>
+                    <pic:cNvPr id="333358588" name=""/>
+                    <pic:cNvPicPr/>
+                  </pic:nvPicPr>
+                  <pic:blipFill>
+                    <a:blip r:embed="rId25"/>
+                    <a:stretch>
+                      <a:fillRect/>
+                    </a:stretch>
+                  </pic:blipFill>
+                  <pic:spPr>
+                    <a:xfrm>
+                      <a:off x="0" y="0"/>
+                      <a:ext cx="5731510" cy="1510665"/>
+                    </a:xfrm>
+                    <a:prstGeom prst="rect">
+                      <a:avLst/>
+                    </a:prstGeom>
+                  </pic:spPr>
+                </pic:pic>
+              </a:graphicData>
+            </a:graphic>
+          </wp:inline>
+        </w:drawing>
+      </w:r>
+    </w:p>
     <w:sectPr>
       <w:pgSz w:w="11906" w:h="16838"/>
       <w:pgMar w:top="1440" w:right="1440" w:bottom="1440" w:left="1440" w:header="720" w:footer="720" w:gutter="0"/>
@@ -561,7 +2454,7 @@
 </file>
 
 <file path=word/numbering.xml><?xml version="1.0" encoding="utf-8"?>
-<w:numbering xmlns:wpc="http://schemas.microsoft.com/office/word/2010/wordprocessingCanvas" xmlns:cx="http://schemas.microsoft.com/office/drawing/2014/chartex" xmlns:cx1="http://schemas.microsoft.com/office/drawing/2015/9/8/chartex" xmlns:cx2="http://schemas.microsoft.com/office/drawing/2015/10/21/chartex" xmlns:cx3="http://schemas.microsoft.com/office/drawing/2016/5/9/chartex" xmlns:cx4="http://schemas.microsoft.com/office/drawing/2016/5/10/chartex" xmlns:cx5="http://schemas.microsoft.com/office/drawing/2016/5/11/chartex" xmlns:cx6="http://schemas.microsoft.com/office/drawing/2016/5/12/chartex" xmlns:cx7="http://schemas.microsoft.com/office/drawing/2016/5/13/chartex" xmlns:cx8="http://schemas.microsoft.com/office/drawing/2016/5/14/chartex" xmlns:mc="http://schemas.openxmlformats.org/markup-compatibility/2006" xmlns:aink="http://schemas.microsoft.com/office/drawing/2016/ink" xmlns:am3d="http://schemas.microsoft.com/office/drawing/2017/model3d" xmlns:o="urn:schemas-microsoft-com:office:office" xmlns:r="http://schemas.openxmlformats.org/officeDocument/2006/relationships" xmlns:m="http://schemas.openxmlformats.org/officeDocument/2006/math" xmlns:v="urn:schemas-microsoft-com:vml" xmlns:wp14="http://schemas.microsoft.com/office/word/2010/wordprocessingDrawing" xmlns:wp="http://schemas.openxmlformats.org/drawingml/2006/wordprocessingDrawing" xmlns:w10="urn:schemas-microsoft-com:office:word" xmlns:w="http://schemas.openxmlformats.org/wordprocessingml/2006/main" xmlns:w14="http://schemas.microsoft.com/office/word/2010/wordml" xmlns:w15="http://schemas.microsoft.com/office/word/2012/wordml" xmlns:w16cex="http://schemas.microsoft.com/office/word/2018/wordml/cex" xmlns:w16cid="http://schemas.microsoft.com/office/word/2016/wordml/cid" xmlns:w16="http://schemas.microsoft.com/office/word/2018/wordml" xmlns:w16sdtdh="http://schemas.microsoft.com/office/word/2020/wordml/sdtdatahash" xmlns:w16se="http://schemas.microsoft.com/office/word/2015/wordml/symex" xmlns:wpg="http://schemas.microsoft.com/office/word/2010/wordprocessingGroup" xmlns:wpi="http://schemas.microsoft.com/office/word/2010/wordprocessingInk" xmlns:wne="http://schemas.microsoft.com/office/word/2006/wordml" xmlns:wps="http://schemas.microsoft.com/office/word/2010/wordprocessingShape" mc:Ignorable="w14 w15 w16se w16cid w16 w16cex w16sdtdh wp14">
+<w:numbering xmlns:wpc="http://schemas.microsoft.com/office/word/2010/wordprocessingCanvas" xmlns:cx="http://schemas.microsoft.com/office/drawing/2014/chartex" xmlns:cx1="http://schemas.microsoft.com/office/drawing/2015/9/8/chartex" xmlns:cx2="http://schemas.microsoft.com/office/drawing/2015/10/21/chartex" xmlns:cx3="http://schemas.microsoft.com/office/drawing/2016/5/9/chartex" xmlns:cx4="http://schemas.microsoft.com/office/drawing/2016/5/10/chartex" xmlns:cx5="http://schemas.microsoft.com/office/drawing/2016/5/11/chartex" xmlns:cx6="http://schemas.microsoft.com/office/drawing/2016/5/12/chartex" xmlns:cx7="http://schemas.microsoft.com/office/drawing/2016/5/13/chartex" xmlns:cx8="http://schemas.microsoft.com/office/drawing/2016/5/14/chartex" xmlns:mc="http://schemas.openxmlformats.org/markup-compatibility/2006" xmlns:aink="http://schemas.microsoft.com/office/drawing/2016/ink" xmlns:am3d="http://schemas.microsoft.com/office/drawing/2017/model3d" xmlns:o="urn:schemas-microsoft-com:office:office" xmlns:oel="http://schemas.microsoft.com/office/2019/extlst" xmlns:r="http://schemas.openxmlformats.org/officeDocument/2006/relationships" xmlns:m="http://schemas.openxmlformats.org/officeDocument/2006/math" xmlns:v="urn:schemas-microsoft-com:vml" xmlns:wp14="http://schemas.microsoft.com/office/word/2010/wordprocessingDrawing" xmlns:wp="http://schemas.openxmlformats.org/drawingml/2006/wordprocessingDrawing" xmlns:w10="urn:schemas-microsoft-com:office:word" xmlns:w="http://schemas.openxmlformats.org/wordprocessingml/2006/main" xmlns:w14="http://schemas.microsoft.com/office/word/2010/wordml" xmlns:w15="http://schemas.microsoft.com/office/word/2012/wordml" xmlns:w16cex="http://schemas.microsoft.com/office/word/2018/wordml/cex" xmlns:w16cid="http://schemas.microsoft.com/office/word/2016/wordml/cid" xmlns:w16="http://schemas.microsoft.com/office/word/2018/wordml" xmlns:w16du="http://schemas.microsoft.com/office/word/2023/wordml/word16du" xmlns:w16sdtdh="http://schemas.microsoft.com/office/word/2020/wordml/sdtdatahash" xmlns:w16sdtfl="http://schemas.microsoft.com/office/word/2024/wordml/sdtformatlock" xmlns:w16se="http://schemas.microsoft.com/office/word/2015/wordml/symex" xmlns:wpg="http://schemas.microsoft.com/office/word/2010/wordprocessingGroup" xmlns:wpi="http://schemas.microsoft.com/office/word/2010/wordprocessingInk" xmlns:wne="http://schemas.microsoft.com/office/word/2006/wordml" xmlns:wps="http://schemas.microsoft.com/office/word/2010/wordprocessingShape" mc:Ignorable="w14 w15 w16se w16cid w16 w16cex w16sdtdh w16sdtfl w16du wp14">
   <w:abstractNum w:abstractNumId="0" w15:restartNumberingAfterBreak="0">
     <w:nsid w:val="075B619A"/>
     <w:multiLevelType w:val="hybridMultilevel"/>
@@ -1069,6 +2962,182 @@
     </w:lvl>
   </w:abstractNum>
   <w:abstractNum w:abstractNumId="4" w15:restartNumberingAfterBreak="0">
+    <w:nsid w:val="332B3D0D"/>
+    <w:multiLevelType w:val="hybridMultilevel"/>
+    <w:tmpl w:val="7040B382"/>
+    <w:lvl w:ilvl="0" w:tplc="DC4251BE">
+      <w:start w:val="1"/>
+      <w:numFmt w:val="decimal"/>
+      <w:lvlText w:val="%1."/>
+      <w:lvlJc w:val="left"/>
+      <w:pPr>
+        <w:ind w:left="1080" w:hanging="360"/>
+      </w:pPr>
+      <w:rPr>
+        <w:rFonts w:hint="default"/>
+        <w:b w:val="0"/>
+      </w:rPr>
+    </w:lvl>
+    <w:lvl w:ilvl="1" w:tplc="08090019" w:tentative="1">
+      <w:start w:val="1"/>
+      <w:numFmt w:val="lowerLetter"/>
+      <w:lvlText w:val="%2."/>
+      <w:lvlJc w:val="left"/>
+      <w:pPr>
+        <w:ind w:left="1800" w:hanging="360"/>
+      </w:pPr>
+    </w:lvl>
+    <w:lvl w:ilvl="2" w:tplc="0809001B" w:tentative="1">
+      <w:start w:val="1"/>
+      <w:numFmt w:val="lowerRoman"/>
+      <w:lvlText w:val="%3."/>
+      <w:lvlJc w:val="right"/>
+      <w:pPr>
+        <w:ind w:left="2520" w:hanging="180"/>
+      </w:pPr>
+    </w:lvl>
+    <w:lvl w:ilvl="3" w:tplc="0809000F" w:tentative="1">
+      <w:start w:val="1"/>
+      <w:numFmt w:val="decimal"/>
+      <w:lvlText w:val="%4."/>
+      <w:lvlJc w:val="left"/>
+      <w:pPr>
+        <w:ind w:left="3240" w:hanging="360"/>
+      </w:pPr>
+    </w:lvl>
+    <w:lvl w:ilvl="4" w:tplc="08090019" w:tentative="1">
+      <w:start w:val="1"/>
+      <w:numFmt w:val="lowerLetter"/>
+      <w:lvlText w:val="%5."/>
+      <w:lvlJc w:val="left"/>
+      <w:pPr>
+        <w:ind w:left="3960" w:hanging="360"/>
+      </w:pPr>
+    </w:lvl>
+    <w:lvl w:ilvl="5" w:tplc="0809001B" w:tentative="1">
+      <w:start w:val="1"/>
+      <w:numFmt w:val="lowerRoman"/>
+      <w:lvlText w:val="%6."/>
+      <w:lvlJc w:val="right"/>
+      <w:pPr>
+        <w:ind w:left="4680" w:hanging="180"/>
+      </w:pPr>
+    </w:lvl>
+    <w:lvl w:ilvl="6" w:tplc="0809000F" w:tentative="1">
+      <w:start w:val="1"/>
+      <w:numFmt w:val="decimal"/>
+      <w:lvlText w:val="%7."/>
+      <w:lvlJc w:val="left"/>
+      <w:pPr>
+        <w:ind w:left="5400" w:hanging="360"/>
+      </w:pPr>
+    </w:lvl>
+    <w:lvl w:ilvl="7" w:tplc="08090019" w:tentative="1">
+      <w:start w:val="1"/>
+      <w:numFmt w:val="lowerLetter"/>
+      <w:lvlText w:val="%8."/>
+      <w:lvlJc w:val="left"/>
+      <w:pPr>
+        <w:ind w:left="6120" w:hanging="360"/>
+      </w:pPr>
+    </w:lvl>
+    <w:lvl w:ilvl="8" w:tplc="0809001B" w:tentative="1">
+      <w:start w:val="1"/>
+      <w:numFmt w:val="lowerRoman"/>
+      <w:lvlText w:val="%9."/>
+      <w:lvlJc w:val="right"/>
+      <w:pPr>
+        <w:ind w:left="6840" w:hanging="180"/>
+      </w:pPr>
+    </w:lvl>
+  </w:abstractNum>
+  <w:abstractNum w:abstractNumId="5" w15:restartNumberingAfterBreak="0">
+    <w:nsid w:val="34165B98"/>
+    <w:multiLevelType w:val="hybridMultilevel"/>
+    <w:tmpl w:val="400C5CB6"/>
+    <w:lvl w:ilvl="0" w:tplc="0809000F">
+      <w:start w:val="1"/>
+      <w:numFmt w:val="decimal"/>
+      <w:lvlText w:val="%1."/>
+      <w:lvlJc w:val="left"/>
+      <w:pPr>
+        <w:ind w:left="720" w:hanging="360"/>
+      </w:pPr>
+    </w:lvl>
+    <w:lvl w:ilvl="1" w:tplc="08090019" w:tentative="1">
+      <w:start w:val="1"/>
+      <w:numFmt w:val="lowerLetter"/>
+      <w:lvlText w:val="%2."/>
+      <w:lvlJc w:val="left"/>
+      <w:pPr>
+        <w:ind w:left="1440" w:hanging="360"/>
+      </w:pPr>
+    </w:lvl>
+    <w:lvl w:ilvl="2" w:tplc="0809001B" w:tentative="1">
+      <w:start w:val="1"/>
+      <w:numFmt w:val="lowerRoman"/>
+      <w:lvlText w:val="%3."/>
+      <w:lvlJc w:val="right"/>
+      <w:pPr>
+        <w:ind w:left="2160" w:hanging="180"/>
+      </w:pPr>
+    </w:lvl>
+    <w:lvl w:ilvl="3" w:tplc="0809000F" w:tentative="1">
+      <w:start w:val="1"/>
+      <w:numFmt w:val="decimal"/>
+      <w:lvlText w:val="%4."/>
+      <w:lvlJc w:val="left"/>
+      <w:pPr>
+        <w:ind w:left="2880" w:hanging="360"/>
+      </w:pPr>
+    </w:lvl>
+    <w:lvl w:ilvl="4" w:tplc="08090019" w:tentative="1">
+      <w:start w:val="1"/>
+      <w:numFmt w:val="lowerLetter"/>
+      <w:lvlText w:val="%5."/>
+      <w:lvlJc w:val="left"/>
+      <w:pPr>
+        <w:ind w:left="3600" w:hanging="360"/>
+      </w:pPr>
+    </w:lvl>
+    <w:lvl w:ilvl="5" w:tplc="0809001B" w:tentative="1">
+      <w:start w:val="1"/>
+      <w:numFmt w:val="lowerRoman"/>
+      <w:lvlText w:val="%6."/>
+      <w:lvlJc w:val="right"/>
+      <w:pPr>
+        <w:ind w:left="4320" w:hanging="180"/>
+      </w:pPr>
+    </w:lvl>
+    <w:lvl w:ilvl="6" w:tplc="0809000F" w:tentative="1">
+      <w:start w:val="1"/>
+      <w:numFmt w:val="decimal"/>
+      <w:lvlText w:val="%7."/>
+      <w:lvlJc w:val="left"/>
+      <w:pPr>
+        <w:ind w:left="5040" w:hanging="360"/>
+      </w:pPr>
+    </w:lvl>
+    <w:lvl w:ilvl="7" w:tplc="08090019" w:tentative="1">
+      <w:start w:val="1"/>
+      <w:numFmt w:val="lowerLetter"/>
+      <w:lvlText w:val="%8."/>
+      <w:lvlJc w:val="left"/>
+      <w:pPr>
+        <w:ind w:left="5760" w:hanging="360"/>
+      </w:pPr>
+    </w:lvl>
+    <w:lvl w:ilvl="8" w:tplc="0809001B" w:tentative="1">
+      <w:start w:val="1"/>
+      <w:numFmt w:val="lowerRoman"/>
+      <w:lvlText w:val="%9."/>
+      <w:lvlJc w:val="right"/>
+      <w:pPr>
+        <w:ind w:left="6480" w:hanging="180"/>
+      </w:pPr>
+    </w:lvl>
+  </w:abstractNum>
+  <w:abstractNum w:abstractNumId="6" w15:restartNumberingAfterBreak="0">
     <w:nsid w:val="44D54624"/>
     <w:multiLevelType w:val="hybridMultilevel"/>
     <w:tmpl w:val="BE3EE69C"/>
@@ -1181,7 +3250,96 @@
       </w:rPr>
     </w:lvl>
   </w:abstractNum>
-  <w:abstractNum w:abstractNumId="5" w15:restartNumberingAfterBreak="0">
+  <w:abstractNum w:abstractNumId="7" w15:restartNumberingAfterBreak="0">
+    <w:nsid w:val="49910125"/>
+    <w:multiLevelType w:val="hybridMultilevel"/>
+    <w:tmpl w:val="ABB2378C"/>
+    <w:lvl w:ilvl="0" w:tplc="0809000F">
+      <w:start w:val="1"/>
+      <w:numFmt w:val="decimal"/>
+      <w:lvlText w:val="%1."/>
+      <w:lvlJc w:val="left"/>
+      <w:pPr>
+        <w:ind w:left="720" w:hanging="360"/>
+      </w:pPr>
+      <w:rPr>
+        <w:rFonts w:hint="default"/>
+      </w:rPr>
+    </w:lvl>
+    <w:lvl w:ilvl="1" w:tplc="08090019" w:tentative="1">
+      <w:start w:val="1"/>
+      <w:numFmt w:val="lowerLetter"/>
+      <w:lvlText w:val="%2."/>
+      <w:lvlJc w:val="left"/>
+      <w:pPr>
+        <w:ind w:left="1440" w:hanging="360"/>
+      </w:pPr>
+    </w:lvl>
+    <w:lvl w:ilvl="2" w:tplc="0809001B" w:tentative="1">
+      <w:start w:val="1"/>
+      <w:numFmt w:val="lowerRoman"/>
+      <w:lvlText w:val="%3."/>
+      <w:lvlJc w:val="right"/>
+      <w:pPr>
+        <w:ind w:left="2160" w:hanging="180"/>
+      </w:pPr>
+    </w:lvl>
+    <w:lvl w:ilvl="3" w:tplc="0809000F" w:tentative="1">
+      <w:start w:val="1"/>
+      <w:numFmt w:val="decimal"/>
+      <w:lvlText w:val="%4."/>
+      <w:lvlJc w:val="left"/>
+      <w:pPr>
+        <w:ind w:left="2880" w:hanging="360"/>
+      </w:pPr>
+    </w:lvl>
+    <w:lvl w:ilvl="4" w:tplc="08090019" w:tentative="1">
+      <w:start w:val="1"/>
+      <w:numFmt w:val="lowerLetter"/>
+      <w:lvlText w:val="%5."/>
+      <w:lvlJc w:val="left"/>
+      <w:pPr>
+        <w:ind w:left="3600" w:hanging="360"/>
+      </w:pPr>
+    </w:lvl>
+    <w:lvl w:ilvl="5" w:tplc="0809001B" w:tentative="1">
+      <w:start w:val="1"/>
+      <w:numFmt w:val="lowerRoman"/>
+      <w:lvlText w:val="%6."/>
+      <w:lvlJc w:val="right"/>
+      <w:pPr>
+        <w:ind w:left="4320" w:hanging="180"/>
+      </w:pPr>
+    </w:lvl>
+    <w:lvl w:ilvl="6" w:tplc="0809000F" w:tentative="1">
+      <w:start w:val="1"/>
+      <w:numFmt w:val="decimal"/>
+      <w:lvlText w:val="%7."/>
+      <w:lvlJc w:val="left"/>
+      <w:pPr>
+        <w:ind w:left="5040" w:hanging="360"/>
+      </w:pPr>
+    </w:lvl>
+    <w:lvl w:ilvl="7" w:tplc="08090019" w:tentative="1">
+      <w:start w:val="1"/>
+      <w:numFmt w:val="lowerLetter"/>
+      <w:lvlText w:val="%8."/>
+      <w:lvlJc w:val="left"/>
+      <w:pPr>
+        <w:ind w:left="5760" w:hanging="360"/>
+      </w:pPr>
+    </w:lvl>
+    <w:lvl w:ilvl="8" w:tplc="0809001B" w:tentative="1">
+      <w:start w:val="1"/>
+      <w:numFmt w:val="lowerRoman"/>
+      <w:lvlText w:val="%9."/>
+      <w:lvlJc w:val="right"/>
+      <w:pPr>
+        <w:ind w:left="6480" w:hanging="180"/>
+      </w:pPr>
+    </w:lvl>
+  </w:abstractNum>
+  <w:abstractNum w:abstractNumId="8" w15:restartNumberingAfterBreak="0">
     <w:nsid w:val="50F4A4FF"/>
     <w:multiLevelType w:val="hybridMultilevel"/>
     <w:tmpl w:val="F5E4B898"/>
@@ -1294,7 +3452,120 @@
       </w:rPr>
     </w:lvl>
   </w:abstractNum>
-  <w:abstractNum w:abstractNumId="6" w15:restartNumberingAfterBreak="0">
+  <w:abstractNum w:abstractNumId="9" w15:restartNumberingAfterBreak="0">
+    <w:nsid w:val="58EC2552"/>
+    <w:multiLevelType w:val="hybridMultilevel"/>
+    <w:tmpl w:val="F2843AB4"/>
+    <w:lvl w:ilvl="0" w:tplc="1D8A8BB4">
+      <w:start w:val="1"/>
+      <w:numFmt w:val="bullet"/>
+      <w:lvlText w:val="-"/>
+      <w:lvlJc w:val="left"/>
+      <w:pPr>
+        <w:ind w:left="720" w:hanging="360"/>
+      </w:pPr>
+      <w:rPr>
+        <w:rFonts w:ascii="Calibri" w:hAnsi="Calibri" w:hint="default"/>
+      </w:rPr>
+    </w:lvl>
+    <w:lvl w:ilvl="1" w:tplc="08090003" w:tentative="1">
+      <w:start w:val="1"/>
+      <w:numFmt w:val="bullet"/>
+      <w:lvlText w:val="o"/>
+      <w:lvlJc w:val="left"/>
+      <w:pPr>
+        <w:ind w:left="1440" w:hanging="360"/>
+      </w:pPr>
+      <w:rPr>
+        <w:rFonts w:ascii="Courier New" w:hAnsi="Courier New" w:cs="Courier New" w:hint="default"/>
+      </w:rPr>
+    </w:lvl>
+    <w:lvl w:ilvl="2" w:tplc="08090005" w:tentative="1">
+      <w:start w:val="1"/>
+      <w:numFmt w:val="bullet"/>
+      <w:lvlText w:val=""/>
+      <w:lvlJc w:val="left"/>
+      <w:pPr>
+        <w:ind w:left="2160" w:hanging="360"/>
+      </w:pPr>
+      <w:rPr>
+        <w:rFonts w:ascii="Wingdings" w:hAnsi="Wingdings" w:hint="default"/>
+      </w:rPr>
+    </w:lvl>
+    <w:lvl w:ilvl="3" w:tplc="08090001" w:tentative="1">
+      <w:start w:val="1"/>
+      <w:numFmt w:val="bullet"/>
+      <w:lvlText w:val=""/>
+      <w:lvlJc w:val="left"/>
+      <w:pPr>
+        <w:ind w:left="2880" w:hanging="360"/>
+      </w:pPr>
+      <w:rPr>
+        <w:rFonts w:ascii="Symbol" w:hAnsi="Symbol" w:hint="default"/>
+      </w:rPr>
+    </w:lvl>
+    <w:lvl w:ilvl="4" w:tplc="08090003" w:tentative="1">
+      <w:start w:val="1"/>
+      <w:numFmt w:val="bullet"/>
+      <w:lvlText w:val="o"/>
+      <w:lvlJc w:val="left"/>
+      <w:pPr>
+        <w:ind w:left="3600" w:hanging="360"/>
+      </w:pPr>
+      <w:rPr>
+        <w:rFonts w:ascii="Courier New" w:hAnsi="Courier New" w:cs="Courier New" w:hint="default"/>
+      </w:rPr>
+    </w:lvl>
+    <w:lvl w:ilvl="5" w:tplc="08090005" w:tentative="1">
+      <w:start w:val="1"/>
+      <w:numFmt w:val="bullet"/>
+      <w:lvlText w:val=""/>
+      <w:lvlJc w:val="left"/>
+      <w:pPr>
+        <w:ind w:left="4320" w:hanging="360"/>
+      </w:pPr>
+      <w:rPr>
+        <w:rFonts w:ascii="Wingdings" w:hAnsi="Wingdings" w:hint="default"/>
+      </w:rPr>
+    </w:lvl>
+    <w:lvl w:ilvl="6" w:tplc="08090001" w:tentative="1">
+      <w:start w:val="1"/>
+      <w:numFmt w:val="bullet"/>
+      <w:lvlText w:val=""/>
+      <w:lvlJc w:val="left"/>
+      <w:pPr>
+        <w:ind w:left="5040" w:hanging="360"/>
+      </w:pPr>
+      <w:rPr>
+        <w:rFonts w:ascii="Symbol" w:hAnsi="Symbol" w:hint="default"/>
+      </w:rPr>
+    </w:lvl>
+    <w:lvl w:ilvl="7" w:tplc="08090003" w:tentative="1">
+      <w:start w:val="1"/>
+      <w:numFmt w:val="bullet"/>
+      <w:lvlText w:val="o"/>
+      <w:lvlJc w:val="left"/>
+      <w:pPr>
+        <w:ind w:left="5760" w:hanging="360"/>
+      </w:pPr>
+      <w:rPr>
+        <w:rFonts w:ascii="Courier New" w:hAnsi="Courier New" w:cs="Courier New" w:hint="default"/>
+      </w:rPr>
+    </w:lvl>
+    <w:lvl w:ilvl="8" w:tplc="08090005" w:tentative="1">
+      <w:start w:val="1"/>
+      <w:numFmt w:val="bullet"/>
+      <w:lvlText w:val=""/>
+      <w:lvlJc w:val="left"/>
+      <w:pPr>
+        <w:ind w:left="6480" w:hanging="360"/>
+      </w:pPr>
+      <w:rPr>
+        <w:rFonts w:ascii="Wingdings" w:hAnsi="Wingdings" w:hint="default"/>
+      </w:rPr>
+    </w:lvl>
+  </w:abstractNum>
+  <w:abstractNum w:abstractNumId="10" w15:restartNumberingAfterBreak="0">
     <w:nsid w:val="5F907363"/>
     <w:multiLevelType w:val="hybridMultilevel"/>
     <w:tmpl w:val="00307708"/>
@@ -1434,7 +3705,7 @@
       </w:rPr>
     </w:lvl>
   </w:abstractNum>
-  <w:abstractNum w:abstractNumId="7" w15:restartNumberingAfterBreak="0">
+  <w:abstractNum w:abstractNumId="11" w15:restartNumberingAfterBreak="0">
     <w:nsid w:val="6B492F7D"/>
     <w:multiLevelType w:val="hybridMultilevel"/>
     <w:tmpl w:val="382C40F2"/>
@@ -1574,7 +3845,7 @@
       </w:rPr>
     </w:lvl>
   </w:abstractNum>
-  <w:abstractNum w:abstractNumId="8" w15:restartNumberingAfterBreak="0">
+  <w:abstractNum w:abstractNumId="12" w15:restartNumberingAfterBreak="0">
     <w:nsid w:val="6E287D0D"/>
     <w:multiLevelType w:val="hybridMultilevel"/>
     <w:tmpl w:val="A94A119C"/>
@@ -1687,38 +3958,139 @@
       </w:rPr>
     </w:lvl>
   </w:abstractNum>
-  <w:num w:numId="1">
+  <w:abstractNum w:abstractNumId="13" w15:restartNumberingAfterBreak="0">
+    <w:nsid w:val="7A9924C7"/>
+    <w:multiLevelType w:val="hybridMultilevel"/>
+    <w:tmpl w:val="400C5CB6"/>
+    <w:lvl w:ilvl="0" w:tplc="FFFFFFFF">
+      <w:start w:val="1"/>
+      <w:numFmt w:val="decimal"/>
+      <w:lvlText w:val="%1."/>
+      <w:lvlJc w:val="left"/>
+      <w:pPr>
+        <w:ind w:left="720" w:hanging="360"/>
+      </w:pPr>
+    </w:lvl>
+    <w:lvl w:ilvl="1" w:tplc="FFFFFFFF" w:tentative="1">
+      <w:start w:val="1"/>
+      <w:numFmt w:val="lowerLetter"/>
+      <w:lvlText w:val="%2."/>
+      <w:lvlJc w:val="left"/>
+      <w:pPr>
+        <w:ind w:left="1440" w:hanging="360"/>
+      </w:pPr>
+    </w:lvl>
+    <w:lvl w:ilvl="2" w:tplc="FFFFFFFF" w:tentative="1">
+      <w:start w:val="1"/>
+      <w:numFmt w:val="lowerRoman"/>
+      <w:lvlText w:val="%3."/>
+      <w:lvlJc w:val="right"/>
+      <w:pPr>
+        <w:ind w:left="2160" w:hanging="180"/>
+      </w:pPr>
+    </w:lvl>
+    <w:lvl w:ilvl="3" w:tplc="FFFFFFFF" w:tentative="1">
+      <w:start w:val="1"/>
+      <w:numFmt w:val="decimal"/>
+      <w:lvlText w:val="%4."/>
+      <w:lvlJc w:val="left"/>
+      <w:pPr>
+        <w:ind w:left="2880" w:hanging="360"/>
+      </w:pPr>
+    </w:lvl>
+    <w:lvl w:ilvl="4" w:tplc="FFFFFFFF" w:tentative="1">
+      <w:start w:val="1"/>
+      <w:numFmt w:val="lowerLetter"/>
+      <w:lvlText w:val="%5."/>
+      <w:lvlJc w:val="left"/>
+      <w:pPr>
+        <w:ind w:left="3600" w:hanging="360"/>
+      </w:pPr>
+    </w:lvl>
+    <w:lvl w:ilvl="5" w:tplc="FFFFFFFF" w:tentative="1">
+      <w:start w:val="1"/>
+      <w:numFmt w:val="lowerRoman"/>
+      <w:lvlText w:val="%6."/>
+      <w:lvlJc w:val="right"/>
+      <w:pPr>
+        <w:ind w:left="4320" w:hanging="180"/>
+      </w:pPr>
+    </w:lvl>
+    <w:lvl w:ilvl="6" w:tplc="FFFFFFFF" w:tentative="1">
+      <w:start w:val="1"/>
+      <w:numFmt w:val="decimal"/>
+      <w:lvlText w:val="%7."/>
+      <w:lvlJc w:val="left"/>
+      <w:pPr>
+        <w:ind w:left="5040" w:hanging="360"/>
+      </w:pPr>
+    </w:lvl>
+    <w:lvl w:ilvl="7" w:tplc="FFFFFFFF" w:tentative="1">
+      <w:start w:val="1"/>
+      <w:numFmt w:val="lowerLetter"/>
+      <w:lvlText w:val="%8."/>
+      <w:lvlJc w:val="left"/>
+      <w:pPr>
+        <w:ind w:left="5760" w:hanging="360"/>
+      </w:pPr>
+    </w:lvl>
+    <w:lvl w:ilvl="8" w:tplc="FFFFFFFF" w:tentative="1">
+      <w:start w:val="1"/>
+      <w:numFmt w:val="lowerRoman"/>
+      <w:lvlText w:val="%9."/>
+      <w:lvlJc w:val="right"/>
+      <w:pPr>
+        <w:ind w:left="6480" w:hanging="180"/>
+      </w:pPr>
+    </w:lvl>
+  </w:abstractNum>
+  <w:num w:numId="1" w16cid:durableId="1752777915">
+    <w:abstractNumId w:val="12"/>
+  </w:num>
+  <w:num w:numId="2" w16cid:durableId="153880198">
+    <w:abstractNumId w:val="3"/>
+  </w:num>
+  <w:num w:numId="3" w16cid:durableId="2137722874">
+    <w:abstractNumId w:val="2"/>
+  </w:num>
+  <w:num w:numId="4" w16cid:durableId="1239167321">
     <w:abstractNumId w:val="8"/>
   </w:num>
-  <w:num w:numId="2">
-    <w:abstractNumId w:val="3"/>
+  <w:num w:numId="5" w16cid:durableId="603466407">
+    <w:abstractNumId w:val="6"/>
   </w:num>
-  <w:num w:numId="3">
-    <w:abstractNumId w:val="2"/>
+  <w:num w:numId="6" w16cid:durableId="1438406138">
+    <w:abstractNumId w:val="1"/>
   </w:num>
-  <w:num w:numId="4">
+  <w:num w:numId="7" w16cid:durableId="978531175">
+    <w:abstractNumId w:val="11"/>
+  </w:num>
+  <w:num w:numId="8" w16cid:durableId="1943150159">
+    <w:abstractNumId w:val="0"/>
+  </w:num>
+  <w:num w:numId="9" w16cid:durableId="1678313834">
+    <w:abstractNumId w:val="10"/>
+  </w:num>
+  <w:num w:numId="10" w16cid:durableId="1771268078">
+    <w:abstractNumId w:val="9"/>
+  </w:num>
+  <w:num w:numId="11" w16cid:durableId="709693755">
     <w:abstractNumId w:val="5"/>
   </w:num>
-  <w:num w:numId="5">
+  <w:num w:numId="12" w16cid:durableId="240407182">
+    <w:abstractNumId w:val="13"/>
+  </w:num>
+  <w:num w:numId="13" w16cid:durableId="677468215">
     <w:abstractNumId w:val="4"/>
   </w:num>
-  <w:num w:numId="6">
-    <w:abstractNumId w:val="1"/>
-  </w:num>
-  <w:num w:numId="7">
+  <w:num w:numId="14" w16cid:durableId="953757257">
     <w:abstractNumId w:val="7"/>
-  </w:num>
-  <w:num w:numId="8">
-    <w:abstractNumId w:val="0"/>
-  </w:num>
-  <w:num w:numId="9">
-    <w:abstractNumId w:val="6"/>
   </w:num>
 </w:numbering>
 </file>
 
 <file path=word/styles.xml><?xml version="1.0" encoding="utf-8"?>
-<w:styles xmlns:mc="http://schemas.openxmlformats.org/markup-compatibility/2006" xmlns:r="http://schemas.openxmlformats.org/officeDocument/2006/relationships" xmlns:w="http://schemas.openxmlformats.org/wordprocessingml/2006/main" xmlns:w14="http://schemas.microsoft.com/office/word/2010/wordml" xmlns:w15="http://schemas.microsoft.com/office/word/2012/wordml" xmlns:w16cex="http://schemas.microsoft.com/office/word/2018/wordml/cex" xmlns:w16cid="http://schemas.microsoft.com/office/word/2016/wordml/cid" xmlns:w16="http://schemas.microsoft.com/office/word/2018/wordml" xmlns:w16sdtdh="http://schemas.microsoft.com/office/word/2020/wordml/sdtdatahash" xmlns:w16se="http://schemas.microsoft.com/office/word/2015/wordml/symex" mc:Ignorable="w14 w15 w16se w16cid w16 w16cex w16sdtdh">
+<w:styles xmlns:mc="http://schemas.openxmlformats.org/markup-compatibility/2006" xmlns:r="http://schemas.openxmlformats.org/officeDocument/2006/relationships" xmlns:w="http://schemas.openxmlformats.org/wordprocessingml/2006/main" xmlns:w14="http://schemas.microsoft.com/office/word/2010/wordml" xmlns:w15="http://schemas.microsoft.com/office/word/2012/wordml" xmlns:w16cex="http://schemas.microsoft.com/office/word/2018/wordml/cex" xmlns:w16cid="http://schemas.microsoft.com/office/word/2016/wordml/cid" xmlns:w16="http://schemas.microsoft.com/office/word/2018/wordml" xmlns:w16du="http://schemas.microsoft.com/office/word/2023/wordml/word16du" xmlns:w16sdtdh="http://schemas.microsoft.com/office/word/2020/wordml/sdtdatahash" xmlns:w16sdtfl="http://schemas.microsoft.com/office/word/2024/wordml/sdtformatlock" xmlns:w16se="http://schemas.microsoft.com/office/word/2015/wordml/symex" mc:Ignorable="w14 w15 w16se w16cid w16 w16cex w16sdtdh w16sdtfl w16du">
   <w:docDefaults>
     <w:rPrDefault>
       <w:rPr>
@@ -2115,6 +4487,7 @@
   <w:style w:type="paragraph" w:default="1" w:styleId="Normal">
     <w:name w:val="Normal"/>
     <w:qFormat/>
+    <w:rsid w:val="006432CC"/>
   </w:style>
   <w:style w:type="paragraph" w:styleId="Heading1">
     <w:name w:val="heading 1"/>
@@ -2137,9 +4510,32 @@
       <w:szCs w:val="32"/>
     </w:rPr>
   </w:style>
+  <w:style w:type="paragraph" w:styleId="Heading2">
+    <w:name w:val="heading 2"/>
+    <w:basedOn w:val="Normal"/>
+    <w:next w:val="Normal"/>
+    <w:link w:val="Heading2Char"/>
+    <w:uiPriority w:val="9"/>
+    <w:unhideWhenUsed/>
+    <w:qFormat/>
+    <w:rsid w:val="00B50FDA"/>
+    <w:pPr>
+      <w:keepNext/>
+      <w:keepLines/>
+      <w:spacing w:before="40" w:after="0"/>
+      <w:outlineLvl w:val="1"/>
+    </w:pPr>
+    <w:rPr>
+      <w:rFonts w:asciiTheme="majorHAnsi" w:eastAsiaTheme="majorEastAsia" w:hAnsiTheme="majorHAnsi" w:cstheme="majorBidi"/>
+      <w:color w:val="2F5496" w:themeColor="accent1" w:themeShade="BF"/>
+      <w:sz w:val="26"/>
+      <w:szCs w:val="26"/>
+    </w:rPr>
+  </w:style>
   <w:style w:type="character" w:default="1" w:styleId="DefaultParagraphFont">
     <w:name w:val="Default Paragraph Font"/>
     <w:uiPriority w:val="1"/>
+    <w:semiHidden/>
     <w:unhideWhenUsed/>
   </w:style>
   <w:style w:type="table" w:default="1" w:styleId="TableNormal">
@@ -2184,6 +4580,50 @@
       <w:color w:val="2F5496" w:themeColor="accent1" w:themeShade="BF"/>
       <w:sz w:val="32"/>
       <w:szCs w:val="32"/>
+    </w:rPr>
+  </w:style>
+  <w:style w:type="character" w:customStyle="1" w:styleId="Heading2Char">
+    <w:name w:val="Heading 2 Char"/>
+    <w:basedOn w:val="DefaultParagraphFont"/>
+    <w:link w:val="Heading2"/>
+    <w:uiPriority w:val="9"/>
+    <w:rsid w:val="00B50FDA"/>
+    <w:rPr>
+      <w:rFonts w:asciiTheme="majorHAnsi" w:eastAsiaTheme="majorEastAsia" w:hAnsiTheme="majorHAnsi" w:cstheme="majorBidi"/>
+      <w:color w:val="2F5496" w:themeColor="accent1" w:themeShade="BF"/>
+      <w:sz w:val="26"/>
+      <w:szCs w:val="26"/>
+    </w:rPr>
+  </w:style>
+  <w:style w:type="paragraph" w:styleId="Subtitle">
+    <w:name w:val="Subtitle"/>
+    <w:basedOn w:val="Normal"/>
+    <w:next w:val="Normal"/>
+    <w:link w:val="SubtitleChar"/>
+    <w:uiPriority w:val="11"/>
+    <w:qFormat/>
+    <w:rsid w:val="00B50FDA"/>
+    <w:pPr>
+      <w:numPr>
+        <w:ilvl w:val="1"/>
+      </w:numPr>
+    </w:pPr>
+    <w:rPr>
+      <w:rFonts w:eastAsiaTheme="minorEastAsia"/>
+      <w:color w:val="5A5A5A" w:themeColor="text1" w:themeTint="A5"/>
+      <w:spacing w:val="15"/>
+    </w:rPr>
+  </w:style>
+  <w:style w:type="character" w:customStyle="1" w:styleId="SubtitleChar">
+    <w:name w:val="Subtitle Char"/>
+    <w:basedOn w:val="DefaultParagraphFont"/>
+    <w:link w:val="Subtitle"/>
+    <w:uiPriority w:val="11"/>
+    <w:rsid w:val="00B50FDA"/>
+    <w:rPr>
+      <w:rFonts w:eastAsiaTheme="minorEastAsia"/>
+      <w:color w:val="5A5A5A" w:themeColor="text1" w:themeTint="A5"/>
+      <w:spacing w:val="15"/>
     </w:rPr>
   </w:style>
 </w:styles>

</xml_diff>